<commit_message>
First Task & second
</commit_message>
<xml_diff>
--- a/AJAX AND JQUERY R&D.docx
+++ b/AJAX AND JQUERY R&D.docx
@@ -25598,6 +25598,4119 @@
         <w:spacing w:before="150" w:after="150" w:line="240" w:lineRule="auto"/>
         <w:outlineLvl w:val="1"/>
         <w:rPr>
+          <w:rFonts w:ascii="Segoe UI" w:eastAsia="Times New Roman" w:hAnsi="Segoe UI" w:cs="Segoe UI"/>
+          <w:color w:val="000000"/>
+          <w:kern w:val="0"/>
+          <w:sz w:val="48"/>
+          <w:szCs w:val="48"/>
+          <w:lang w:eastAsia="en-IN"/>
+          <w14:ligatures w14:val="none"/>
+        </w:rPr>
+      </w:pPr>
+      <w:r>
+        <w:rPr>
+          <w:rFonts w:ascii="Segoe UI" w:eastAsia="Times New Roman" w:hAnsi="Segoe UI" w:cs="Segoe UI"/>
+          <w:color w:val="000000"/>
+          <w:kern w:val="0"/>
+          <w:sz w:val="48"/>
+          <w:szCs w:val="48"/>
+          <w:lang w:eastAsia="en-IN"/>
+          <w14:ligatures w14:val="none"/>
+        </w:rPr>
+        <w:t xml:space="preserve">                    DAY_3_JQUERY</w:t>
+      </w:r>
+    </w:p>
+    <w:p>
+      <w:pPr>
+        <w:shd w:val="clear" w:color="auto" w:fill="FFFFFF"/>
+        <w:spacing w:before="150" w:after="150" w:line="240" w:lineRule="auto"/>
+        <w:outlineLvl w:val="1"/>
+        <w:rPr>
+          <w:bCs/>
+          <w:color w:val="000000" w:themeColor="text1"/>
+          <w:sz w:val="24"/>
+          <w:szCs w:val="24"/>
+          <w14:shadow w14:blurRad="38100" w14:dist="19050" w14:dir="2700000" w14:sx="100000" w14:sy="100000" w14:kx="0" w14:ky="0" w14:algn="tl">
+            <w14:schemeClr w14:val="dk1">
+              <w14:alpha w14:val="60000"/>
+            </w14:schemeClr>
+          </w14:shadow>
+          <w14:textOutline w14:w="0" w14:cap="flat" w14:cmpd="sng" w14:algn="ctr">
+            <w14:noFill/>
+            <w14:prstDash w14:val="solid"/>
+            <w14:round/>
+          </w14:textOutline>
+        </w:rPr>
+      </w:pPr>
+    </w:p>
+    <w:p>
+      <w:pPr>
+        <w:shd w:val="clear" w:color="auto" w:fill="FFFFFF"/>
+        <w:spacing w:before="150" w:after="150" w:line="240" w:lineRule="auto"/>
+        <w:outlineLvl w:val="1"/>
+        <w:rPr>
+          <w:rFonts w:ascii="Segoe UI" w:eastAsia="Times New Roman" w:hAnsi="Segoe UI" w:cs="Segoe UI"/>
+          <w:color w:val="000000"/>
+          <w:kern w:val="0"/>
+          <w:sz w:val="48"/>
+          <w:szCs w:val="48"/>
+          <w:lang w:eastAsia="en-IN"/>
+          <w14:ligatures w14:val="none"/>
+        </w:rPr>
+      </w:pPr>
+      <w:proofErr w:type="spellStart"/>
+      <w:r>
+        <w:rPr>
+          <w:rFonts w:ascii="Segoe UI" w:eastAsia="Times New Roman" w:hAnsi="Segoe UI" w:cs="Segoe UI"/>
+          <w:color w:val="000000"/>
+          <w:kern w:val="0"/>
+          <w:sz w:val="48"/>
+          <w:szCs w:val="48"/>
+          <w:lang w:eastAsia="en-IN"/>
+          <w14:ligatures w14:val="none"/>
+        </w:rPr>
+        <w:t>JQuery</w:t>
+      </w:r>
+      <w:proofErr w:type="spellEnd"/>
+      <w:r>
+        <w:rPr>
+          <w:rFonts w:ascii="Segoe UI" w:eastAsia="Times New Roman" w:hAnsi="Segoe UI" w:cs="Segoe UI"/>
+          <w:color w:val="000000"/>
+          <w:kern w:val="0"/>
+          <w:sz w:val="48"/>
+          <w:szCs w:val="48"/>
+          <w:lang w:eastAsia="en-IN"/>
+          <w14:ligatures w14:val="none"/>
+        </w:rPr>
+        <w:t xml:space="preserve"> Post Method</w:t>
+      </w:r>
+    </w:p>
+    <w:p>
+      <w:pPr>
+        <w:rPr>
+          <w:rFonts w:ascii="Segoe UI" w:hAnsi="Segoe UI" w:cs="Segoe UI"/>
+          <w:color w:val="000000"/>
+        </w:rPr>
+      </w:pPr>
+      <w:r>
+        <w:rPr>
+          <w:rFonts w:ascii="Segoe UI" w:eastAsia="Times New Roman" w:hAnsi="Segoe UI" w:cs="Segoe UI"/>
+          <w:color w:val="000000"/>
+          <w:kern w:val="0"/>
+          <w:lang w:eastAsia="en-IN"/>
+          <w14:ligatures w14:val="none"/>
+        </w:rPr>
+        <w:br w:type="page"/>
+      </w:r>
+      <w:r>
+        <w:rPr>
+          <w:rFonts w:ascii="Segoe UI" w:hAnsi="Segoe UI" w:cs="Segoe UI"/>
+          <w:color w:val="000000"/>
+        </w:rPr>
+        <w:lastRenderedPageBreak/>
+        <w:t>The </w:t>
+      </w:r>
+      <w:proofErr w:type="gramStart"/>
+      <w:r>
+        <w:rPr>
+          <w:rFonts w:ascii="Segoe UI" w:hAnsi="Segoe UI" w:cs="Segoe UI"/>
+          <w:color w:val="000000"/>
+        </w:rPr>
+        <w:t>$.post</w:t>
+      </w:r>
+      <w:proofErr w:type="gramEnd"/>
+      <w:r>
+        <w:rPr>
+          <w:rFonts w:ascii="Segoe UI" w:hAnsi="Segoe UI" w:cs="Segoe UI"/>
+          <w:color w:val="000000"/>
+        </w:rPr>
+        <w:t>() method requests data from the server using an HTTP POST request.</w:t>
+      </w:r>
+    </w:p>
+    <w:p>
+      <w:pPr>
+        <w:rPr>
+          <w:rFonts w:ascii="Segoe UI" w:eastAsia="Times New Roman" w:hAnsi="Segoe UI" w:cs="Segoe UI"/>
+          <w:color w:val="000000"/>
+          <w:kern w:val="0"/>
+          <w:lang w:eastAsia="en-IN"/>
+          <w14:ligatures w14:val="none"/>
+        </w:rPr>
+      </w:pPr>
+      <w:r>
+        <w:rPr>
+          <w:rFonts w:ascii="Segoe UI" w:eastAsia="Times New Roman" w:hAnsi="Segoe UI" w:cs="Segoe UI"/>
+          <w:b/>
+          <w:bCs/>
+          <w:color w:val="000000"/>
+          <w:kern w:val="0"/>
+          <w:lang w:eastAsia="en-IN"/>
+          <w14:ligatures w14:val="none"/>
+        </w:rPr>
+        <w:t>Syntax:</w:t>
+      </w:r>
+    </w:p>
+    <w:p>
+      <w:pPr>
+        <w:rPr>
+          <w:rFonts w:ascii="Segoe UI" w:eastAsia="Times New Roman" w:hAnsi="Segoe UI" w:cs="Segoe UI"/>
+          <w:color w:val="000000"/>
+          <w:kern w:val="0"/>
+          <w:lang w:eastAsia="en-IN"/>
+          <w14:ligatures w14:val="none"/>
+        </w:rPr>
+      </w:pPr>
+      <w:proofErr w:type="gramStart"/>
+      <w:r>
+        <w:rPr>
+          <w:rFonts w:ascii="Segoe UI" w:eastAsia="Times New Roman" w:hAnsi="Segoe UI" w:cs="Segoe UI"/>
+          <w:color w:val="000000"/>
+          <w:kern w:val="0"/>
+          <w:lang w:eastAsia="en-IN"/>
+          <w14:ligatures w14:val="none"/>
+        </w:rPr>
+        <w:t>$.post</w:t>
+      </w:r>
+      <w:proofErr w:type="gramEnd"/>
+      <w:r>
+        <w:rPr>
+          <w:rFonts w:ascii="Segoe UI" w:eastAsia="Times New Roman" w:hAnsi="Segoe UI" w:cs="Segoe UI"/>
+          <w:color w:val="000000"/>
+          <w:kern w:val="0"/>
+          <w:lang w:eastAsia="en-IN"/>
+          <w14:ligatures w14:val="none"/>
+        </w:rPr>
+        <w:t>(</w:t>
+      </w:r>
+      <w:proofErr w:type="spellStart"/>
+      <w:r>
+        <w:rPr>
+          <w:rFonts w:ascii="Segoe UI" w:eastAsia="Times New Roman" w:hAnsi="Segoe UI" w:cs="Segoe UI"/>
+          <w:i/>
+          <w:iCs/>
+          <w:color w:val="000000"/>
+          <w:kern w:val="0"/>
+          <w:lang w:eastAsia="en-IN"/>
+          <w14:ligatures w14:val="none"/>
+        </w:rPr>
+        <w:t>URL,data,callback</w:t>
+      </w:r>
+      <w:proofErr w:type="spellEnd"/>
+      <w:r>
+        <w:rPr>
+          <w:rFonts w:ascii="Segoe UI" w:eastAsia="Times New Roman" w:hAnsi="Segoe UI" w:cs="Segoe UI"/>
+          <w:color w:val="000000"/>
+          <w:kern w:val="0"/>
+          <w:lang w:eastAsia="en-IN"/>
+          <w14:ligatures w14:val="none"/>
+        </w:rPr>
+        <w:t>);</w:t>
+      </w:r>
+    </w:p>
+    <w:p>
+      <w:pPr>
+        <w:rPr>
+          <w:rFonts w:ascii="Segoe UI" w:eastAsia="Times New Roman" w:hAnsi="Segoe UI" w:cs="Segoe UI"/>
+          <w:color w:val="000000"/>
+          <w:kern w:val="0"/>
+          <w:lang w:eastAsia="en-IN"/>
+          <w14:ligatures w14:val="none"/>
+        </w:rPr>
+      </w:pPr>
+      <w:r>
+        <w:rPr>
+          <w:rFonts w:ascii="Segoe UI" w:eastAsia="Times New Roman" w:hAnsi="Segoe UI" w:cs="Segoe UI"/>
+          <w:color w:val="000000"/>
+          <w:kern w:val="0"/>
+          <w:lang w:eastAsia="en-IN"/>
+          <w14:ligatures w14:val="none"/>
+        </w:rPr>
+        <w:t>The required URL parameter specifies the URL you wish to request.</w:t>
+      </w:r>
+    </w:p>
+    <w:p>
+      <w:pPr>
+        <w:rPr>
+          <w:rFonts w:ascii="Segoe UI" w:eastAsia="Times New Roman" w:hAnsi="Segoe UI" w:cs="Segoe UI"/>
+          <w:color w:val="000000"/>
+          <w:kern w:val="0"/>
+          <w:lang w:eastAsia="en-IN"/>
+          <w14:ligatures w14:val="none"/>
+        </w:rPr>
+      </w:pPr>
+      <w:r>
+        <w:rPr>
+          <w:rFonts w:ascii="Segoe UI" w:eastAsia="Times New Roman" w:hAnsi="Segoe UI" w:cs="Segoe UI"/>
+          <w:color w:val="000000"/>
+          <w:kern w:val="0"/>
+          <w:lang w:eastAsia="en-IN"/>
+          <w14:ligatures w14:val="none"/>
+        </w:rPr>
+        <w:t>The optional data parameter specifies some data to send along with the request.</w:t>
+      </w:r>
+    </w:p>
+    <w:p>
+      <w:pPr>
+        <w:rPr>
+          <w:rFonts w:ascii="Segoe UI" w:eastAsia="Times New Roman" w:hAnsi="Segoe UI" w:cs="Segoe UI"/>
+          <w:color w:val="000000"/>
+          <w:kern w:val="0"/>
+          <w:lang w:eastAsia="en-IN"/>
+          <w14:ligatures w14:val="none"/>
+        </w:rPr>
+      </w:pPr>
+      <w:r>
+        <w:rPr>
+          <w:rFonts w:ascii="Segoe UI" w:eastAsia="Times New Roman" w:hAnsi="Segoe UI" w:cs="Segoe UI"/>
+          <w:color w:val="000000"/>
+          <w:kern w:val="0"/>
+          <w:lang w:eastAsia="en-IN"/>
+          <w14:ligatures w14:val="none"/>
+        </w:rPr>
+        <w:t xml:space="preserve">The optional callback parameter is the name of a function to be executed if the request </w:t>
+      </w:r>
+      <w:proofErr w:type="spellStart"/>
+      <w:r>
+        <w:rPr>
+          <w:rFonts w:ascii="Segoe UI" w:eastAsia="Times New Roman" w:hAnsi="Segoe UI" w:cs="Segoe UI"/>
+          <w:color w:val="000000"/>
+          <w:kern w:val="0"/>
+          <w:lang w:eastAsia="en-IN"/>
+          <w14:ligatures w14:val="none"/>
+        </w:rPr>
+        <w:t>succee</w:t>
+      </w:r>
+      <w:proofErr w:type="spellEnd"/>
+    </w:p>
+    <w:p>
+      <w:pPr>
+        <w:rPr>
+          <w:rFonts w:ascii="Segoe UI" w:eastAsia="Times New Roman" w:hAnsi="Segoe UI" w:cs="Segoe UI"/>
+          <w:color w:val="000000"/>
+          <w:kern w:val="0"/>
+          <w:lang w:eastAsia="en-IN"/>
+          <w14:ligatures w14:val="none"/>
+        </w:rPr>
+      </w:pPr>
+    </w:p>
+    <w:p>
+      <w:pPr>
+        <w:shd w:val="clear" w:color="auto" w:fill="FFFFFF"/>
+        <w:spacing w:before="150" w:after="150" w:line="240" w:lineRule="auto"/>
+        <w:outlineLvl w:val="1"/>
+        <w:rPr>
+          <w:rFonts w:ascii="Segoe UI" w:eastAsia="Times New Roman" w:hAnsi="Segoe UI" w:cs="Segoe UI"/>
+          <w:color w:val="000000"/>
+          <w:kern w:val="0"/>
+          <w:sz w:val="24"/>
+          <w:szCs w:val="24"/>
+          <w:lang w:eastAsia="en-IN"/>
+          <w14:ligatures w14:val="none"/>
+        </w:rPr>
+      </w:pPr>
+      <w:r>
+        <w:rPr>
+          <w:rFonts w:ascii="Segoe UI" w:eastAsia="Times New Roman" w:hAnsi="Segoe UI" w:cs="Segoe UI"/>
+          <w:color w:val="000000"/>
+          <w:kern w:val="0"/>
+          <w:sz w:val="24"/>
+          <w:szCs w:val="24"/>
+          <w:lang w:eastAsia="en-IN"/>
+          <w14:ligatures w14:val="none"/>
+        </w:rPr>
+        <w:t> $(document</w:t>
+      </w:r>
+      <w:proofErr w:type="gramStart"/>
+      <w:r>
+        <w:rPr>
+          <w:rFonts w:ascii="Segoe UI" w:eastAsia="Times New Roman" w:hAnsi="Segoe UI" w:cs="Segoe UI"/>
+          <w:color w:val="000000"/>
+          <w:kern w:val="0"/>
+          <w:sz w:val="24"/>
+          <w:szCs w:val="24"/>
+          <w:lang w:eastAsia="en-IN"/>
+          <w14:ligatures w14:val="none"/>
+        </w:rPr>
+        <w:t>).ready</w:t>
+      </w:r>
+      <w:proofErr w:type="gramEnd"/>
+      <w:r>
+        <w:rPr>
+          <w:rFonts w:ascii="Segoe UI" w:eastAsia="Times New Roman" w:hAnsi="Segoe UI" w:cs="Segoe UI"/>
+          <w:color w:val="000000"/>
+          <w:kern w:val="0"/>
+          <w:sz w:val="24"/>
+          <w:szCs w:val="24"/>
+          <w:lang w:eastAsia="en-IN"/>
+          <w14:ligatures w14:val="none"/>
+        </w:rPr>
+        <w:t>(</w:t>
+      </w:r>
+      <w:r>
+        <w:rPr>
+          <w:rFonts w:ascii="Segoe UI" w:eastAsia="Times New Roman" w:hAnsi="Segoe UI" w:cs="Segoe UI"/>
+          <w:i/>
+          <w:iCs/>
+          <w:color w:val="000000"/>
+          <w:kern w:val="0"/>
+          <w:sz w:val="24"/>
+          <w:szCs w:val="24"/>
+          <w:lang w:eastAsia="en-IN"/>
+          <w14:ligatures w14:val="none"/>
+        </w:rPr>
+        <w:t>function</w:t>
+      </w:r>
+      <w:r>
+        <w:rPr>
+          <w:rFonts w:ascii="Segoe UI" w:eastAsia="Times New Roman" w:hAnsi="Segoe UI" w:cs="Segoe UI"/>
+          <w:color w:val="000000"/>
+          <w:kern w:val="0"/>
+          <w:sz w:val="24"/>
+          <w:szCs w:val="24"/>
+          <w:lang w:eastAsia="en-IN"/>
+          <w14:ligatures w14:val="none"/>
+        </w:rPr>
+        <w:t>(){</w:t>
+      </w:r>
+    </w:p>
+    <w:p>
+      <w:pPr>
+        <w:shd w:val="clear" w:color="auto" w:fill="FFFFFF"/>
+        <w:spacing w:before="150" w:after="150" w:line="240" w:lineRule="auto"/>
+        <w:outlineLvl w:val="1"/>
+        <w:rPr>
+          <w:rFonts w:ascii="Segoe UI" w:eastAsia="Times New Roman" w:hAnsi="Segoe UI" w:cs="Segoe UI"/>
+          <w:color w:val="000000"/>
+          <w:kern w:val="0"/>
+          <w:sz w:val="24"/>
+          <w:szCs w:val="24"/>
+          <w:lang w:eastAsia="en-IN"/>
+          <w14:ligatures w14:val="none"/>
+        </w:rPr>
+      </w:pPr>
+      <w:r>
+        <w:rPr>
+          <w:rFonts w:ascii="Segoe UI" w:eastAsia="Times New Roman" w:hAnsi="Segoe UI" w:cs="Segoe UI"/>
+          <w:color w:val="000000"/>
+          <w:kern w:val="0"/>
+          <w:sz w:val="24"/>
+          <w:szCs w:val="24"/>
+          <w:lang w:eastAsia="en-IN"/>
+          <w14:ligatures w14:val="none"/>
+        </w:rPr>
+        <w:t>    $("button"</w:t>
+      </w:r>
+      <w:proofErr w:type="gramStart"/>
+      <w:r>
+        <w:rPr>
+          <w:rFonts w:ascii="Segoe UI" w:eastAsia="Times New Roman" w:hAnsi="Segoe UI" w:cs="Segoe UI"/>
+          <w:color w:val="000000"/>
+          <w:kern w:val="0"/>
+          <w:sz w:val="24"/>
+          <w:szCs w:val="24"/>
+          <w:lang w:eastAsia="en-IN"/>
+          <w14:ligatures w14:val="none"/>
+        </w:rPr>
+        <w:t>).click</w:t>
+      </w:r>
+      <w:proofErr w:type="gramEnd"/>
+      <w:r>
+        <w:rPr>
+          <w:rFonts w:ascii="Segoe UI" w:eastAsia="Times New Roman" w:hAnsi="Segoe UI" w:cs="Segoe UI"/>
+          <w:color w:val="000000"/>
+          <w:kern w:val="0"/>
+          <w:sz w:val="24"/>
+          <w:szCs w:val="24"/>
+          <w:lang w:eastAsia="en-IN"/>
+          <w14:ligatures w14:val="none"/>
+        </w:rPr>
+        <w:t>(</w:t>
+      </w:r>
+      <w:r>
+        <w:rPr>
+          <w:rFonts w:ascii="Segoe UI" w:eastAsia="Times New Roman" w:hAnsi="Segoe UI" w:cs="Segoe UI"/>
+          <w:i/>
+          <w:iCs/>
+          <w:color w:val="000000"/>
+          <w:kern w:val="0"/>
+          <w:sz w:val="24"/>
+          <w:szCs w:val="24"/>
+          <w:lang w:eastAsia="en-IN"/>
+          <w14:ligatures w14:val="none"/>
+        </w:rPr>
+        <w:t>function</w:t>
+      </w:r>
+      <w:r>
+        <w:rPr>
+          <w:rFonts w:ascii="Segoe UI" w:eastAsia="Times New Roman" w:hAnsi="Segoe UI" w:cs="Segoe UI"/>
+          <w:color w:val="000000"/>
+          <w:kern w:val="0"/>
+          <w:sz w:val="24"/>
+          <w:szCs w:val="24"/>
+          <w:lang w:eastAsia="en-IN"/>
+          <w14:ligatures w14:val="none"/>
+        </w:rPr>
+        <w:t>(){</w:t>
+      </w:r>
+    </w:p>
+    <w:p>
+      <w:pPr>
+        <w:shd w:val="clear" w:color="auto" w:fill="FFFFFF"/>
+        <w:spacing w:before="150" w:after="150" w:line="240" w:lineRule="auto"/>
+        <w:outlineLvl w:val="1"/>
+        <w:rPr>
+          <w:rFonts w:ascii="Segoe UI" w:eastAsia="Times New Roman" w:hAnsi="Segoe UI" w:cs="Segoe UI"/>
+          <w:color w:val="000000"/>
+          <w:kern w:val="0"/>
+          <w:sz w:val="24"/>
+          <w:szCs w:val="24"/>
+          <w:lang w:eastAsia="en-IN"/>
+          <w14:ligatures w14:val="none"/>
+        </w:rPr>
+      </w:pPr>
+      <w:r>
+        <w:rPr>
+          <w:rFonts w:ascii="Segoe UI" w:eastAsia="Times New Roman" w:hAnsi="Segoe UI" w:cs="Segoe UI"/>
+          <w:color w:val="000000"/>
+          <w:kern w:val="0"/>
+          <w:sz w:val="24"/>
+          <w:szCs w:val="24"/>
+          <w:lang w:eastAsia="en-IN"/>
+          <w14:ligatures w14:val="none"/>
+        </w:rPr>
+        <w:t xml:space="preserve">      </w:t>
+      </w:r>
+      <w:proofErr w:type="gramStart"/>
+      <w:r>
+        <w:rPr>
+          <w:rFonts w:ascii="Segoe UI" w:eastAsia="Times New Roman" w:hAnsi="Segoe UI" w:cs="Segoe UI"/>
+          <w:color w:val="000000"/>
+          <w:kern w:val="0"/>
+          <w:sz w:val="24"/>
+          <w:szCs w:val="24"/>
+          <w:lang w:eastAsia="en-IN"/>
+          <w14:ligatures w14:val="none"/>
+        </w:rPr>
+        <w:t>$.post</w:t>
+      </w:r>
+      <w:proofErr w:type="gramEnd"/>
+      <w:r>
+        <w:rPr>
+          <w:rFonts w:ascii="Segoe UI" w:eastAsia="Times New Roman" w:hAnsi="Segoe UI" w:cs="Segoe UI"/>
+          <w:color w:val="000000"/>
+          <w:kern w:val="0"/>
+          <w:sz w:val="24"/>
+          <w:szCs w:val="24"/>
+          <w:lang w:eastAsia="en-IN"/>
+          <w14:ligatures w14:val="none"/>
+        </w:rPr>
+        <w:t>("demo_test_post.asp",</w:t>
+      </w:r>
+    </w:p>
+    <w:p>
+      <w:pPr>
+        <w:shd w:val="clear" w:color="auto" w:fill="FFFFFF"/>
+        <w:spacing w:before="150" w:after="150" w:line="240" w:lineRule="auto"/>
+        <w:outlineLvl w:val="1"/>
+        <w:rPr>
+          <w:rFonts w:ascii="Segoe UI" w:eastAsia="Times New Roman" w:hAnsi="Segoe UI" w:cs="Segoe UI"/>
+          <w:color w:val="000000"/>
+          <w:kern w:val="0"/>
+          <w:sz w:val="24"/>
+          <w:szCs w:val="24"/>
+          <w:lang w:eastAsia="en-IN"/>
+          <w14:ligatures w14:val="none"/>
+        </w:rPr>
+      </w:pPr>
+      <w:r>
+        <w:rPr>
+          <w:rFonts w:ascii="Segoe UI" w:eastAsia="Times New Roman" w:hAnsi="Segoe UI" w:cs="Segoe UI"/>
+          <w:color w:val="000000"/>
+          <w:kern w:val="0"/>
+          <w:sz w:val="24"/>
+          <w:szCs w:val="24"/>
+          <w:lang w:eastAsia="en-IN"/>
+          <w14:ligatures w14:val="none"/>
+        </w:rPr>
+        <w:t>      {</w:t>
+      </w:r>
+    </w:p>
+    <w:p>
+      <w:pPr>
+        <w:shd w:val="clear" w:color="auto" w:fill="FFFFFF"/>
+        <w:spacing w:before="150" w:after="150" w:line="240" w:lineRule="auto"/>
+        <w:outlineLvl w:val="1"/>
+        <w:rPr>
+          <w:rFonts w:ascii="Segoe UI" w:eastAsia="Times New Roman" w:hAnsi="Segoe UI" w:cs="Segoe UI"/>
+          <w:color w:val="000000"/>
+          <w:kern w:val="0"/>
+          <w:sz w:val="24"/>
+          <w:szCs w:val="24"/>
+          <w:lang w:eastAsia="en-IN"/>
+          <w14:ligatures w14:val="none"/>
+        </w:rPr>
+      </w:pPr>
+      <w:r>
+        <w:rPr>
+          <w:rFonts w:ascii="Segoe UI" w:eastAsia="Times New Roman" w:hAnsi="Segoe UI" w:cs="Segoe UI"/>
+          <w:color w:val="000000"/>
+          <w:kern w:val="0"/>
+          <w:sz w:val="24"/>
+          <w:szCs w:val="24"/>
+          <w:lang w:eastAsia="en-IN"/>
+          <w14:ligatures w14:val="none"/>
+        </w:rPr>
+        <w:t>        name: "Donald Duck",</w:t>
+      </w:r>
+    </w:p>
+    <w:p>
+      <w:pPr>
+        <w:shd w:val="clear" w:color="auto" w:fill="FFFFFF"/>
+        <w:spacing w:before="150" w:after="150" w:line="240" w:lineRule="auto"/>
+        <w:outlineLvl w:val="1"/>
+        <w:rPr>
+          <w:rFonts w:ascii="Segoe UI" w:eastAsia="Times New Roman" w:hAnsi="Segoe UI" w:cs="Segoe UI"/>
+          <w:color w:val="000000"/>
+          <w:kern w:val="0"/>
+          <w:sz w:val="24"/>
+          <w:szCs w:val="24"/>
+          <w:lang w:eastAsia="en-IN"/>
+          <w14:ligatures w14:val="none"/>
+        </w:rPr>
+      </w:pPr>
+      <w:r>
+        <w:rPr>
+          <w:rFonts w:ascii="Segoe UI" w:eastAsia="Times New Roman" w:hAnsi="Segoe UI" w:cs="Segoe UI"/>
+          <w:color w:val="000000"/>
+          <w:kern w:val="0"/>
+          <w:sz w:val="24"/>
+          <w:szCs w:val="24"/>
+          <w:lang w:eastAsia="en-IN"/>
+          <w14:ligatures w14:val="none"/>
+        </w:rPr>
+        <w:t>        city: "Duckburg"</w:t>
+      </w:r>
+    </w:p>
+    <w:p>
+      <w:pPr>
+        <w:shd w:val="clear" w:color="auto" w:fill="FFFFFF"/>
+        <w:spacing w:before="150" w:after="150" w:line="240" w:lineRule="auto"/>
+        <w:outlineLvl w:val="1"/>
+        <w:rPr>
+          <w:rFonts w:ascii="Segoe UI" w:eastAsia="Times New Roman" w:hAnsi="Segoe UI" w:cs="Segoe UI"/>
+          <w:color w:val="000000"/>
+          <w:kern w:val="0"/>
+          <w:sz w:val="24"/>
+          <w:szCs w:val="24"/>
+          <w:lang w:eastAsia="en-IN"/>
+          <w14:ligatures w14:val="none"/>
+        </w:rPr>
+      </w:pPr>
+      <w:r>
+        <w:rPr>
+          <w:rFonts w:ascii="Segoe UI" w:eastAsia="Times New Roman" w:hAnsi="Segoe UI" w:cs="Segoe UI"/>
+          <w:color w:val="000000"/>
+          <w:kern w:val="0"/>
+          <w:sz w:val="24"/>
+          <w:szCs w:val="24"/>
+          <w:lang w:eastAsia="en-IN"/>
+          <w14:ligatures w14:val="none"/>
+        </w:rPr>
+        <w:t>      },</w:t>
+      </w:r>
+    </w:p>
+    <w:p>
+      <w:pPr>
+        <w:shd w:val="clear" w:color="auto" w:fill="FFFFFF"/>
+        <w:spacing w:before="150" w:after="150" w:line="240" w:lineRule="auto"/>
+        <w:outlineLvl w:val="1"/>
+        <w:rPr>
+          <w:rFonts w:ascii="Segoe UI" w:eastAsia="Times New Roman" w:hAnsi="Segoe UI" w:cs="Segoe UI"/>
+          <w:color w:val="000000"/>
+          <w:kern w:val="0"/>
+          <w:sz w:val="24"/>
+          <w:szCs w:val="24"/>
+          <w:lang w:eastAsia="en-IN"/>
+          <w14:ligatures w14:val="none"/>
+        </w:rPr>
+      </w:pPr>
+      <w:r>
+        <w:rPr>
+          <w:rFonts w:ascii="Segoe UI" w:eastAsia="Times New Roman" w:hAnsi="Segoe UI" w:cs="Segoe UI"/>
+          <w:color w:val="000000"/>
+          <w:kern w:val="0"/>
+          <w:sz w:val="24"/>
+          <w:szCs w:val="24"/>
+          <w:lang w:eastAsia="en-IN"/>
+          <w14:ligatures w14:val="none"/>
+        </w:rPr>
+        <w:t xml:space="preserve">      </w:t>
+      </w:r>
+      <w:r>
+        <w:rPr>
+          <w:rFonts w:ascii="Segoe UI" w:eastAsia="Times New Roman" w:hAnsi="Segoe UI" w:cs="Segoe UI"/>
+          <w:i/>
+          <w:iCs/>
+          <w:color w:val="000000"/>
+          <w:kern w:val="0"/>
+          <w:sz w:val="24"/>
+          <w:szCs w:val="24"/>
+          <w:lang w:eastAsia="en-IN"/>
+          <w14:ligatures w14:val="none"/>
+        </w:rPr>
+        <w:t>function</w:t>
+      </w:r>
+      <w:r>
+        <w:rPr>
+          <w:rFonts w:ascii="Segoe UI" w:eastAsia="Times New Roman" w:hAnsi="Segoe UI" w:cs="Segoe UI"/>
+          <w:color w:val="000000"/>
+          <w:kern w:val="0"/>
+          <w:sz w:val="24"/>
+          <w:szCs w:val="24"/>
+          <w:lang w:eastAsia="en-IN"/>
+          <w14:ligatures w14:val="none"/>
+        </w:rPr>
+        <w:t>(</w:t>
+      </w:r>
+      <w:proofErr w:type="spellStart"/>
+      <w:proofErr w:type="gramStart"/>
+      <w:r>
+        <w:rPr>
+          <w:rFonts w:ascii="Segoe UI" w:eastAsia="Times New Roman" w:hAnsi="Segoe UI" w:cs="Segoe UI"/>
+          <w:i/>
+          <w:iCs/>
+          <w:color w:val="000000"/>
+          <w:kern w:val="0"/>
+          <w:sz w:val="24"/>
+          <w:szCs w:val="24"/>
+          <w:lang w:eastAsia="en-IN"/>
+          <w14:ligatures w14:val="none"/>
+        </w:rPr>
+        <w:t>data</w:t>
+      </w:r>
+      <w:r>
+        <w:rPr>
+          <w:rFonts w:ascii="Segoe UI" w:eastAsia="Times New Roman" w:hAnsi="Segoe UI" w:cs="Segoe UI"/>
+          <w:color w:val="000000"/>
+          <w:kern w:val="0"/>
+          <w:sz w:val="24"/>
+          <w:szCs w:val="24"/>
+          <w:lang w:eastAsia="en-IN"/>
+          <w14:ligatures w14:val="none"/>
+        </w:rPr>
+        <w:t>,</w:t>
+      </w:r>
+      <w:r>
+        <w:rPr>
+          <w:rFonts w:ascii="Segoe UI" w:eastAsia="Times New Roman" w:hAnsi="Segoe UI" w:cs="Segoe UI"/>
+          <w:i/>
+          <w:iCs/>
+          <w:color w:val="000000"/>
+          <w:kern w:val="0"/>
+          <w:sz w:val="24"/>
+          <w:szCs w:val="24"/>
+          <w:lang w:eastAsia="en-IN"/>
+          <w14:ligatures w14:val="none"/>
+        </w:rPr>
+        <w:t>status</w:t>
+      </w:r>
+      <w:proofErr w:type="spellEnd"/>
+      <w:proofErr w:type="gramEnd"/>
+      <w:r>
+        <w:rPr>
+          <w:rFonts w:ascii="Segoe UI" w:eastAsia="Times New Roman" w:hAnsi="Segoe UI" w:cs="Segoe UI"/>
+          <w:color w:val="000000"/>
+          <w:kern w:val="0"/>
+          <w:sz w:val="24"/>
+          <w:szCs w:val="24"/>
+          <w:lang w:eastAsia="en-IN"/>
+          <w14:ligatures w14:val="none"/>
+        </w:rPr>
+        <w:t>){</w:t>
+      </w:r>
+    </w:p>
+    <w:p>
+      <w:pPr>
+        <w:shd w:val="clear" w:color="auto" w:fill="FFFFFF"/>
+        <w:spacing w:before="150" w:after="150" w:line="240" w:lineRule="auto"/>
+        <w:outlineLvl w:val="1"/>
+        <w:rPr>
+          <w:rFonts w:ascii="Segoe UI" w:eastAsia="Times New Roman" w:hAnsi="Segoe UI" w:cs="Segoe UI"/>
+          <w:color w:val="000000"/>
+          <w:kern w:val="0"/>
+          <w:sz w:val="24"/>
+          <w:szCs w:val="24"/>
+          <w:lang w:eastAsia="en-IN"/>
+          <w14:ligatures w14:val="none"/>
+        </w:rPr>
+      </w:pPr>
+      <w:r>
+        <w:rPr>
+          <w:rFonts w:ascii="Segoe UI" w:eastAsia="Times New Roman" w:hAnsi="Segoe UI" w:cs="Segoe UI"/>
+          <w:color w:val="000000"/>
+          <w:kern w:val="0"/>
+          <w:sz w:val="24"/>
+          <w:szCs w:val="24"/>
+          <w:lang w:eastAsia="en-IN"/>
+          <w14:ligatures w14:val="none"/>
+        </w:rPr>
+        <w:t xml:space="preserve">        </w:t>
+      </w:r>
+      <w:proofErr w:type="gramStart"/>
+      <w:r>
+        <w:rPr>
+          <w:rFonts w:ascii="Segoe UI" w:eastAsia="Times New Roman" w:hAnsi="Segoe UI" w:cs="Segoe UI"/>
+          <w:color w:val="000000"/>
+          <w:kern w:val="0"/>
+          <w:sz w:val="24"/>
+          <w:szCs w:val="24"/>
+          <w:lang w:eastAsia="en-IN"/>
+          <w14:ligatures w14:val="none"/>
+        </w:rPr>
+        <w:t>alert(</w:t>
+      </w:r>
+      <w:proofErr w:type="gramEnd"/>
+      <w:r>
+        <w:rPr>
+          <w:rFonts w:ascii="Segoe UI" w:eastAsia="Times New Roman" w:hAnsi="Segoe UI" w:cs="Segoe UI"/>
+          <w:color w:val="000000"/>
+          <w:kern w:val="0"/>
+          <w:sz w:val="24"/>
+          <w:szCs w:val="24"/>
+          <w:lang w:eastAsia="en-IN"/>
+          <w14:ligatures w14:val="none"/>
+        </w:rPr>
+        <w:t>"Data: " + data + "\</w:t>
+      </w:r>
+      <w:proofErr w:type="spellStart"/>
+      <w:r>
+        <w:rPr>
+          <w:rFonts w:ascii="Segoe UI" w:eastAsia="Times New Roman" w:hAnsi="Segoe UI" w:cs="Segoe UI"/>
+          <w:color w:val="000000"/>
+          <w:kern w:val="0"/>
+          <w:sz w:val="24"/>
+          <w:szCs w:val="24"/>
+          <w:lang w:eastAsia="en-IN"/>
+          <w14:ligatures w14:val="none"/>
+        </w:rPr>
+        <w:t>nStatus</w:t>
+      </w:r>
+      <w:proofErr w:type="spellEnd"/>
+      <w:r>
+        <w:rPr>
+          <w:rFonts w:ascii="Segoe UI" w:eastAsia="Times New Roman" w:hAnsi="Segoe UI" w:cs="Segoe UI"/>
+          <w:color w:val="000000"/>
+          <w:kern w:val="0"/>
+          <w:sz w:val="24"/>
+          <w:szCs w:val="24"/>
+          <w:lang w:eastAsia="en-IN"/>
+          <w14:ligatures w14:val="none"/>
+        </w:rPr>
+        <w:t>: " + status);</w:t>
+      </w:r>
+    </w:p>
+    <w:p>
+      <w:pPr>
+        <w:shd w:val="clear" w:color="auto" w:fill="FFFFFF"/>
+        <w:spacing w:before="150" w:after="150" w:line="240" w:lineRule="auto"/>
+        <w:outlineLvl w:val="1"/>
+        <w:rPr>
+          <w:rFonts w:ascii="Segoe UI" w:eastAsia="Times New Roman" w:hAnsi="Segoe UI" w:cs="Segoe UI"/>
+          <w:color w:val="000000"/>
+          <w:kern w:val="0"/>
+          <w:sz w:val="24"/>
+          <w:szCs w:val="24"/>
+          <w:lang w:eastAsia="en-IN"/>
+          <w14:ligatures w14:val="none"/>
+        </w:rPr>
+      </w:pPr>
+      <w:r>
+        <w:rPr>
+          <w:rFonts w:ascii="Segoe UI" w:eastAsia="Times New Roman" w:hAnsi="Segoe UI" w:cs="Segoe UI"/>
+          <w:color w:val="000000"/>
+          <w:kern w:val="0"/>
+          <w:sz w:val="24"/>
+          <w:szCs w:val="24"/>
+          <w:lang w:eastAsia="en-IN"/>
+          <w14:ligatures w14:val="none"/>
+        </w:rPr>
+        <w:t>      });</w:t>
+      </w:r>
+    </w:p>
+    <w:p>
+      <w:pPr>
+        <w:shd w:val="clear" w:color="auto" w:fill="FFFFFF"/>
+        <w:spacing w:before="150" w:after="150" w:line="240" w:lineRule="auto"/>
+        <w:outlineLvl w:val="1"/>
+        <w:rPr>
+          <w:rFonts w:ascii="Segoe UI" w:eastAsia="Times New Roman" w:hAnsi="Segoe UI" w:cs="Segoe UI"/>
+          <w:color w:val="000000"/>
+          <w:kern w:val="0"/>
+          <w:sz w:val="24"/>
+          <w:szCs w:val="24"/>
+          <w:lang w:eastAsia="en-IN"/>
+          <w14:ligatures w14:val="none"/>
+        </w:rPr>
+      </w:pPr>
+      <w:r>
+        <w:rPr>
+          <w:rFonts w:ascii="Segoe UI" w:eastAsia="Times New Roman" w:hAnsi="Segoe UI" w:cs="Segoe UI"/>
+          <w:color w:val="000000"/>
+          <w:kern w:val="0"/>
+          <w:sz w:val="24"/>
+          <w:szCs w:val="24"/>
+          <w:lang w:eastAsia="en-IN"/>
+          <w14:ligatures w14:val="none"/>
+        </w:rPr>
+        <w:t>    });</w:t>
+      </w:r>
+    </w:p>
+    <w:p>
+      <w:pPr>
+        <w:shd w:val="clear" w:color="auto" w:fill="FFFFFF"/>
+        <w:spacing w:before="150" w:after="150" w:line="240" w:lineRule="auto"/>
+        <w:outlineLvl w:val="1"/>
+        <w:rPr>
+          <w:rFonts w:ascii="Segoe UI" w:eastAsia="Times New Roman" w:hAnsi="Segoe UI" w:cs="Segoe UI"/>
+          <w:color w:val="000000"/>
+          <w:kern w:val="0"/>
+          <w:sz w:val="24"/>
+          <w:szCs w:val="24"/>
+          <w:lang w:eastAsia="en-IN"/>
+          <w14:ligatures w14:val="none"/>
+        </w:rPr>
+      </w:pPr>
+      <w:r>
+        <w:rPr>
+          <w:rFonts w:ascii="Segoe UI" w:eastAsia="Times New Roman" w:hAnsi="Segoe UI" w:cs="Segoe UI"/>
+          <w:color w:val="000000"/>
+          <w:kern w:val="0"/>
+          <w:sz w:val="24"/>
+          <w:szCs w:val="24"/>
+          <w:lang w:eastAsia="en-IN"/>
+          <w14:ligatures w14:val="none"/>
+        </w:rPr>
+        <w:t>  });</w:t>
+      </w:r>
+    </w:p>
+    <w:p>
+      <w:pPr>
+        <w:shd w:val="clear" w:color="auto" w:fill="FFFFFF"/>
+        <w:spacing w:before="150" w:after="150" w:line="240" w:lineRule="auto"/>
+        <w:outlineLvl w:val="1"/>
+        <w:rPr>
+          <w:rFonts w:ascii="Segoe UI" w:eastAsia="Times New Roman" w:hAnsi="Segoe UI" w:cs="Segoe UI"/>
+          <w:color w:val="000000"/>
+          <w:kern w:val="0"/>
+          <w:sz w:val="48"/>
+          <w:szCs w:val="48"/>
+          <w:lang w:eastAsia="en-IN"/>
+          <w14:ligatures w14:val="none"/>
+        </w:rPr>
+      </w:pPr>
+    </w:p>
+    <w:p>
+      <w:pPr>
+        <w:shd w:val="clear" w:color="auto" w:fill="FFFFFF"/>
+        <w:spacing w:before="150" w:after="150" w:line="240" w:lineRule="auto"/>
+        <w:outlineLvl w:val="1"/>
+        <w:rPr>
+          <w:rFonts w:ascii="Segoe UI" w:eastAsia="Times New Roman" w:hAnsi="Segoe UI" w:cs="Segoe UI"/>
+          <w:color w:val="000000"/>
+          <w:kern w:val="0"/>
+          <w:sz w:val="48"/>
+          <w:szCs w:val="48"/>
+          <w:lang w:eastAsia="en-IN"/>
+          <w14:ligatures w14:val="none"/>
+        </w:rPr>
+      </w:pPr>
+      <w:proofErr w:type="spellStart"/>
+      <w:r>
+        <w:rPr>
+          <w:rFonts w:ascii="Segoe UI" w:eastAsia="Times New Roman" w:hAnsi="Segoe UI" w:cs="Segoe UI"/>
+          <w:color w:val="000000"/>
+          <w:kern w:val="0"/>
+          <w:sz w:val="48"/>
+          <w:szCs w:val="48"/>
+          <w:lang w:eastAsia="en-IN"/>
+          <w14:ligatures w14:val="none"/>
+        </w:rPr>
+        <w:t>JQuery</w:t>
+      </w:r>
+      <w:proofErr w:type="spellEnd"/>
+      <w:r>
+        <w:rPr>
+          <w:rFonts w:ascii="Segoe UI" w:eastAsia="Times New Roman" w:hAnsi="Segoe UI" w:cs="Segoe UI"/>
+          <w:color w:val="000000"/>
+          <w:kern w:val="0"/>
+          <w:sz w:val="48"/>
+          <w:szCs w:val="48"/>
+          <w:lang w:eastAsia="en-IN"/>
+          <w14:ligatures w14:val="none"/>
+        </w:rPr>
+        <w:t xml:space="preserve"> Filter Method</w:t>
+      </w:r>
+    </w:p>
+    <w:p>
+      <w:pPr>
+        <w:shd w:val="clear" w:color="auto" w:fill="FFFFFF"/>
+        <w:spacing w:before="150" w:after="150" w:line="240" w:lineRule="auto"/>
+        <w:outlineLvl w:val="1"/>
+        <w:rPr>
+          <w:bCs/>
+          <w:color w:val="000000" w:themeColor="text1"/>
+          <w:sz w:val="24"/>
+          <w:szCs w:val="24"/>
+          <w14:shadow w14:blurRad="38100" w14:dist="19050" w14:dir="2700000" w14:sx="100000" w14:sy="100000" w14:kx="0" w14:ky="0" w14:algn="tl">
+            <w14:schemeClr w14:val="dk1">
+              <w14:alpha w14:val="60000"/>
+            </w14:schemeClr>
+          </w14:shadow>
+          <w14:textOutline w14:w="0" w14:cap="flat" w14:cmpd="sng" w14:algn="ctr">
+            <w14:noFill/>
+            <w14:prstDash w14:val="solid"/>
+            <w14:round/>
+          </w14:textOutline>
+        </w:rPr>
+      </w:pPr>
+      <w:r>
+        <w:rPr>
+          <w:bCs/>
+          <w:color w:val="000000" w:themeColor="text1"/>
+          <w:sz w:val="24"/>
+          <w:szCs w:val="24"/>
+          <w14:shadow w14:blurRad="38100" w14:dist="19050" w14:dir="2700000" w14:sx="100000" w14:sy="100000" w14:kx="0" w14:ky="0" w14:algn="tl">
+            <w14:schemeClr w14:val="dk1">
+              <w14:alpha w14:val="60000"/>
+            </w14:schemeClr>
+          </w14:shadow>
+          <w14:textOutline w14:w="0" w14:cap="flat" w14:cmpd="sng" w14:algn="ctr">
+            <w14:noFill/>
+            <w14:prstDash w14:val="solid"/>
+            <w14:round/>
+          </w14:textOutline>
+        </w:rPr>
+        <w:t>se jQuery to filter/search for specific elements.</w:t>
+      </w:r>
+    </w:p>
+    <w:p>
+      <w:pPr>
+        <w:shd w:val="clear" w:color="auto" w:fill="FFFFFF"/>
+        <w:spacing w:before="150" w:after="150" w:line="240" w:lineRule="auto"/>
+        <w:outlineLvl w:val="1"/>
+        <w:rPr>
+          <w:bCs/>
+          <w:color w:val="000000" w:themeColor="text1"/>
+          <w:sz w:val="24"/>
+          <w:szCs w:val="24"/>
+          <w14:shadow w14:blurRad="38100" w14:dist="19050" w14:dir="2700000" w14:sx="100000" w14:sy="100000" w14:kx="0" w14:ky="0" w14:algn="tl">
+            <w14:schemeClr w14:val="dk1">
+              <w14:alpha w14:val="60000"/>
+            </w14:schemeClr>
+          </w14:shadow>
+          <w14:textOutline w14:w="0" w14:cap="flat" w14:cmpd="sng" w14:algn="ctr">
+            <w14:noFill/>
+            <w14:prstDash w14:val="solid"/>
+            <w14:round/>
+          </w14:textOutline>
+        </w:rPr>
+      </w:pPr>
+      <w:r>
+        <w:rPr>
+          <w:bCs/>
+          <w:color w:val="000000" w:themeColor="text1"/>
+          <w:sz w:val="24"/>
+          <w:szCs w:val="24"/>
+          <w14:shadow w14:blurRad="38100" w14:dist="19050" w14:dir="2700000" w14:sx="100000" w14:sy="100000" w14:kx="0" w14:ky="0" w14:algn="tl">
+            <w14:schemeClr w14:val="dk1">
+              <w14:alpha w14:val="60000"/>
+            </w14:schemeClr>
+          </w14:shadow>
+          <w14:textOutline w14:w="0" w14:cap="flat" w14:cmpd="sng" w14:algn="ctr">
+            <w14:noFill/>
+            <w14:prstDash w14:val="solid"/>
+            <w14:round/>
+          </w14:textOutline>
+        </w:rPr>
+        <w:t> $(document</w:t>
+      </w:r>
+      <w:proofErr w:type="gramStart"/>
+      <w:r>
+        <w:rPr>
+          <w:bCs/>
+          <w:color w:val="000000" w:themeColor="text1"/>
+          <w:sz w:val="24"/>
+          <w:szCs w:val="24"/>
+          <w14:shadow w14:blurRad="38100" w14:dist="19050" w14:dir="2700000" w14:sx="100000" w14:sy="100000" w14:kx="0" w14:ky="0" w14:algn="tl">
+            <w14:schemeClr w14:val="dk1">
+              <w14:alpha w14:val="60000"/>
+            </w14:schemeClr>
+          </w14:shadow>
+          <w14:textOutline w14:w="0" w14:cap="flat" w14:cmpd="sng" w14:algn="ctr">
+            <w14:noFill/>
+            <w14:prstDash w14:val="solid"/>
+            <w14:round/>
+          </w14:textOutline>
+        </w:rPr>
+        <w:t>).ready</w:t>
+      </w:r>
+      <w:proofErr w:type="gramEnd"/>
+      <w:r>
+        <w:rPr>
+          <w:bCs/>
+          <w:color w:val="000000" w:themeColor="text1"/>
+          <w:sz w:val="24"/>
+          <w:szCs w:val="24"/>
+          <w14:shadow w14:blurRad="38100" w14:dist="19050" w14:dir="2700000" w14:sx="100000" w14:sy="100000" w14:kx="0" w14:ky="0" w14:algn="tl">
+            <w14:schemeClr w14:val="dk1">
+              <w14:alpha w14:val="60000"/>
+            </w14:schemeClr>
+          </w14:shadow>
+          <w14:textOutline w14:w="0" w14:cap="flat" w14:cmpd="sng" w14:algn="ctr">
+            <w14:noFill/>
+            <w14:prstDash w14:val="solid"/>
+            <w14:round/>
+          </w14:textOutline>
+        </w:rPr>
+        <w:t>(</w:t>
+      </w:r>
+      <w:r>
+        <w:rPr>
+          <w:bCs/>
+          <w:i/>
+          <w:iCs/>
+          <w:color w:val="000000" w:themeColor="text1"/>
+          <w:sz w:val="24"/>
+          <w:szCs w:val="24"/>
+          <w14:shadow w14:blurRad="38100" w14:dist="19050" w14:dir="2700000" w14:sx="100000" w14:sy="100000" w14:kx="0" w14:ky="0" w14:algn="tl">
+            <w14:schemeClr w14:val="dk1">
+              <w14:alpha w14:val="60000"/>
+            </w14:schemeClr>
+          </w14:shadow>
+          <w14:textOutline w14:w="0" w14:cap="flat" w14:cmpd="sng" w14:algn="ctr">
+            <w14:noFill/>
+            <w14:prstDash w14:val="solid"/>
+            <w14:round/>
+          </w14:textOutline>
+        </w:rPr>
+        <w:t>function</w:t>
+      </w:r>
+      <w:r>
+        <w:rPr>
+          <w:bCs/>
+          <w:color w:val="000000" w:themeColor="text1"/>
+          <w:sz w:val="24"/>
+          <w:szCs w:val="24"/>
+          <w14:shadow w14:blurRad="38100" w14:dist="19050" w14:dir="2700000" w14:sx="100000" w14:sy="100000" w14:kx="0" w14:ky="0" w14:algn="tl">
+            <w14:schemeClr w14:val="dk1">
+              <w14:alpha w14:val="60000"/>
+            </w14:schemeClr>
+          </w14:shadow>
+          <w14:textOutline w14:w="0" w14:cap="flat" w14:cmpd="sng" w14:algn="ctr">
+            <w14:noFill/>
+            <w14:prstDash w14:val="solid"/>
+            <w14:round/>
+          </w14:textOutline>
+        </w:rPr>
+        <w:t>(){</w:t>
+      </w:r>
+    </w:p>
+    <w:p>
+      <w:pPr>
+        <w:shd w:val="clear" w:color="auto" w:fill="FFFFFF"/>
+        <w:spacing w:before="150" w:after="150" w:line="240" w:lineRule="auto"/>
+        <w:outlineLvl w:val="1"/>
+        <w:rPr>
+          <w:bCs/>
+          <w:color w:val="000000" w:themeColor="text1"/>
+          <w:sz w:val="24"/>
+          <w:szCs w:val="24"/>
+          <w14:shadow w14:blurRad="38100" w14:dist="19050" w14:dir="2700000" w14:sx="100000" w14:sy="100000" w14:kx="0" w14:ky="0" w14:algn="tl">
+            <w14:schemeClr w14:val="dk1">
+              <w14:alpha w14:val="60000"/>
+            </w14:schemeClr>
+          </w14:shadow>
+          <w14:textOutline w14:w="0" w14:cap="flat" w14:cmpd="sng" w14:algn="ctr">
+            <w14:noFill/>
+            <w14:prstDash w14:val="solid"/>
+            <w14:round/>
+          </w14:textOutline>
+        </w:rPr>
+      </w:pPr>
+      <w:r>
+        <w:rPr>
+          <w:bCs/>
+          <w:color w:val="000000" w:themeColor="text1"/>
+          <w:sz w:val="24"/>
+          <w:szCs w:val="24"/>
+          <w14:shadow w14:blurRad="38100" w14:dist="19050" w14:dir="2700000" w14:sx="100000" w14:sy="100000" w14:kx="0" w14:ky="0" w14:algn="tl">
+            <w14:schemeClr w14:val="dk1">
+              <w14:alpha w14:val="60000"/>
+            </w14:schemeClr>
+          </w14:shadow>
+          <w14:textOutline w14:w="0" w14:cap="flat" w14:cmpd="sng" w14:algn="ctr">
+            <w14:noFill/>
+            <w14:prstDash w14:val="solid"/>
+            <w14:round/>
+          </w14:textOutline>
+        </w:rPr>
+        <w:t>    $("#</w:t>
+      </w:r>
+      <w:proofErr w:type="spellStart"/>
+      <w:r>
+        <w:rPr>
+          <w:bCs/>
+          <w:color w:val="000000" w:themeColor="text1"/>
+          <w:sz w:val="24"/>
+          <w:szCs w:val="24"/>
+          <w14:shadow w14:blurRad="38100" w14:dist="19050" w14:dir="2700000" w14:sx="100000" w14:sy="100000" w14:kx="0" w14:ky="0" w14:algn="tl">
+            <w14:schemeClr w14:val="dk1">
+              <w14:alpha w14:val="60000"/>
+            </w14:schemeClr>
+          </w14:shadow>
+          <w14:textOutline w14:w="0" w14:cap="flat" w14:cmpd="sng" w14:algn="ctr">
+            <w14:noFill/>
+            <w14:prstDash w14:val="solid"/>
+            <w14:round/>
+          </w14:textOutline>
+        </w:rPr>
+        <w:t>myInput</w:t>
+      </w:r>
+      <w:proofErr w:type="spellEnd"/>
+      <w:r>
+        <w:rPr>
+          <w:bCs/>
+          <w:color w:val="000000" w:themeColor="text1"/>
+          <w:sz w:val="24"/>
+          <w:szCs w:val="24"/>
+          <w14:shadow w14:blurRad="38100" w14:dist="19050" w14:dir="2700000" w14:sx="100000" w14:sy="100000" w14:kx="0" w14:ky="0" w14:algn="tl">
+            <w14:schemeClr w14:val="dk1">
+              <w14:alpha w14:val="60000"/>
+            </w14:schemeClr>
+          </w14:shadow>
+          <w14:textOutline w14:w="0" w14:cap="flat" w14:cmpd="sng" w14:algn="ctr">
+            <w14:noFill/>
+            <w14:prstDash w14:val="solid"/>
+            <w14:round/>
+          </w14:textOutline>
+        </w:rPr>
+        <w:t>"</w:t>
+      </w:r>
+      <w:proofErr w:type="gramStart"/>
+      <w:r>
+        <w:rPr>
+          <w:bCs/>
+          <w:color w:val="000000" w:themeColor="text1"/>
+          <w:sz w:val="24"/>
+          <w:szCs w:val="24"/>
+          <w14:shadow w14:blurRad="38100" w14:dist="19050" w14:dir="2700000" w14:sx="100000" w14:sy="100000" w14:kx="0" w14:ky="0" w14:algn="tl">
+            <w14:schemeClr w14:val="dk1">
+              <w14:alpha w14:val="60000"/>
+            </w14:schemeClr>
+          </w14:shadow>
+          <w14:textOutline w14:w="0" w14:cap="flat" w14:cmpd="sng" w14:algn="ctr">
+            <w14:noFill/>
+            <w14:prstDash w14:val="solid"/>
+            <w14:round/>
+          </w14:textOutline>
+        </w:rPr>
+        <w:t>).on</w:t>
+      </w:r>
+      <w:proofErr w:type="gramEnd"/>
+      <w:r>
+        <w:rPr>
+          <w:bCs/>
+          <w:color w:val="000000" w:themeColor="text1"/>
+          <w:sz w:val="24"/>
+          <w:szCs w:val="24"/>
+          <w14:shadow w14:blurRad="38100" w14:dist="19050" w14:dir="2700000" w14:sx="100000" w14:sy="100000" w14:kx="0" w14:ky="0" w14:algn="tl">
+            <w14:schemeClr w14:val="dk1">
+              <w14:alpha w14:val="60000"/>
+            </w14:schemeClr>
+          </w14:shadow>
+          <w14:textOutline w14:w="0" w14:cap="flat" w14:cmpd="sng" w14:algn="ctr">
+            <w14:noFill/>
+            <w14:prstDash w14:val="solid"/>
+            <w14:round/>
+          </w14:textOutline>
+        </w:rPr>
+        <w:t>("</w:t>
+      </w:r>
+      <w:proofErr w:type="spellStart"/>
+      <w:r>
+        <w:rPr>
+          <w:bCs/>
+          <w:color w:val="000000" w:themeColor="text1"/>
+          <w:sz w:val="24"/>
+          <w:szCs w:val="24"/>
+          <w14:shadow w14:blurRad="38100" w14:dist="19050" w14:dir="2700000" w14:sx="100000" w14:sy="100000" w14:kx="0" w14:ky="0" w14:algn="tl">
+            <w14:schemeClr w14:val="dk1">
+              <w14:alpha w14:val="60000"/>
+            </w14:schemeClr>
+          </w14:shadow>
+          <w14:textOutline w14:w="0" w14:cap="flat" w14:cmpd="sng" w14:algn="ctr">
+            <w14:noFill/>
+            <w14:prstDash w14:val="solid"/>
+            <w14:round/>
+          </w14:textOutline>
+        </w:rPr>
+        <w:t>keyup</w:t>
+      </w:r>
+      <w:proofErr w:type="spellEnd"/>
+      <w:r>
+        <w:rPr>
+          <w:bCs/>
+          <w:color w:val="000000" w:themeColor="text1"/>
+          <w:sz w:val="24"/>
+          <w:szCs w:val="24"/>
+          <w14:shadow w14:blurRad="38100" w14:dist="19050" w14:dir="2700000" w14:sx="100000" w14:sy="100000" w14:kx="0" w14:ky="0" w14:algn="tl">
+            <w14:schemeClr w14:val="dk1">
+              <w14:alpha w14:val="60000"/>
+            </w14:schemeClr>
+          </w14:shadow>
+          <w14:textOutline w14:w="0" w14:cap="flat" w14:cmpd="sng" w14:algn="ctr">
+            <w14:noFill/>
+            <w14:prstDash w14:val="solid"/>
+            <w14:round/>
+          </w14:textOutline>
+        </w:rPr>
+        <w:t xml:space="preserve">", </w:t>
+      </w:r>
+      <w:r>
+        <w:rPr>
+          <w:bCs/>
+          <w:i/>
+          <w:iCs/>
+          <w:color w:val="000000" w:themeColor="text1"/>
+          <w:sz w:val="24"/>
+          <w:szCs w:val="24"/>
+          <w14:shadow w14:blurRad="38100" w14:dist="19050" w14:dir="2700000" w14:sx="100000" w14:sy="100000" w14:kx="0" w14:ky="0" w14:algn="tl">
+            <w14:schemeClr w14:val="dk1">
+              <w14:alpha w14:val="60000"/>
+            </w14:schemeClr>
+          </w14:shadow>
+          <w14:textOutline w14:w="0" w14:cap="flat" w14:cmpd="sng" w14:algn="ctr">
+            <w14:noFill/>
+            <w14:prstDash w14:val="solid"/>
+            <w14:round/>
+          </w14:textOutline>
+        </w:rPr>
+        <w:t>function</w:t>
+      </w:r>
+      <w:r>
+        <w:rPr>
+          <w:bCs/>
+          <w:color w:val="000000" w:themeColor="text1"/>
+          <w:sz w:val="24"/>
+          <w:szCs w:val="24"/>
+          <w14:shadow w14:blurRad="38100" w14:dist="19050" w14:dir="2700000" w14:sx="100000" w14:sy="100000" w14:kx="0" w14:ky="0" w14:algn="tl">
+            <w14:schemeClr w14:val="dk1">
+              <w14:alpha w14:val="60000"/>
+            </w14:schemeClr>
+          </w14:shadow>
+          <w14:textOutline w14:w="0" w14:cap="flat" w14:cmpd="sng" w14:algn="ctr">
+            <w14:noFill/>
+            <w14:prstDash w14:val="solid"/>
+            <w14:round/>
+          </w14:textOutline>
+        </w:rPr>
+        <w:t>() {</w:t>
+      </w:r>
+    </w:p>
+    <w:p>
+      <w:pPr>
+        <w:shd w:val="clear" w:color="auto" w:fill="FFFFFF"/>
+        <w:spacing w:before="150" w:after="150" w:line="240" w:lineRule="auto"/>
+        <w:outlineLvl w:val="1"/>
+        <w:rPr>
+          <w:bCs/>
+          <w:color w:val="000000" w:themeColor="text1"/>
+          <w:sz w:val="24"/>
+          <w:szCs w:val="24"/>
+          <w14:shadow w14:blurRad="38100" w14:dist="19050" w14:dir="2700000" w14:sx="100000" w14:sy="100000" w14:kx="0" w14:ky="0" w14:algn="tl">
+            <w14:schemeClr w14:val="dk1">
+              <w14:alpha w14:val="60000"/>
+            </w14:schemeClr>
+          </w14:shadow>
+          <w14:textOutline w14:w="0" w14:cap="flat" w14:cmpd="sng" w14:algn="ctr">
+            <w14:noFill/>
+            <w14:prstDash w14:val="solid"/>
+            <w14:round/>
+          </w14:textOutline>
+        </w:rPr>
+      </w:pPr>
+      <w:r>
+        <w:rPr>
+          <w:bCs/>
+          <w:color w:val="000000" w:themeColor="text1"/>
+          <w:sz w:val="24"/>
+          <w:szCs w:val="24"/>
+          <w14:shadow w14:blurRad="38100" w14:dist="19050" w14:dir="2700000" w14:sx="100000" w14:sy="100000" w14:kx="0" w14:ky="0" w14:algn="tl">
+            <w14:schemeClr w14:val="dk1">
+              <w14:alpha w14:val="60000"/>
+            </w14:schemeClr>
+          </w14:shadow>
+          <w14:textOutline w14:w="0" w14:cap="flat" w14:cmpd="sng" w14:algn="ctr">
+            <w14:noFill/>
+            <w14:prstDash w14:val="solid"/>
+            <w14:round/>
+          </w14:textOutline>
+        </w:rPr>
+        <w:t xml:space="preserve">      </w:t>
+      </w:r>
+      <w:proofErr w:type="spellStart"/>
+      <w:r>
+        <w:rPr>
+          <w:bCs/>
+          <w:i/>
+          <w:iCs/>
+          <w:color w:val="000000" w:themeColor="text1"/>
+          <w:sz w:val="24"/>
+          <w:szCs w:val="24"/>
+          <w14:shadow w14:blurRad="38100" w14:dist="19050" w14:dir="2700000" w14:sx="100000" w14:sy="100000" w14:kx="0" w14:ky="0" w14:algn="tl">
+            <w14:schemeClr w14:val="dk1">
+              <w14:alpha w14:val="60000"/>
+            </w14:schemeClr>
+          </w14:shadow>
+          <w14:textOutline w14:w="0" w14:cap="flat" w14:cmpd="sng" w14:algn="ctr">
+            <w14:noFill/>
+            <w14:prstDash w14:val="solid"/>
+            <w14:round/>
+          </w14:textOutline>
+        </w:rPr>
+        <w:t>const</w:t>
+      </w:r>
+      <w:proofErr w:type="spellEnd"/>
+      <w:r>
+        <w:rPr>
+          <w:bCs/>
+          <w:color w:val="000000" w:themeColor="text1"/>
+          <w:sz w:val="24"/>
+          <w:szCs w:val="24"/>
+          <w14:shadow w14:blurRad="38100" w14:dist="19050" w14:dir="2700000" w14:sx="100000" w14:sy="100000" w14:kx="0" w14:ky="0" w14:algn="tl">
+            <w14:schemeClr w14:val="dk1">
+              <w14:alpha w14:val="60000"/>
+            </w14:schemeClr>
+          </w14:shadow>
+          <w14:textOutline w14:w="0" w14:cap="flat" w14:cmpd="sng" w14:algn="ctr">
+            <w14:noFill/>
+            <w14:prstDash w14:val="solid"/>
+            <w14:round/>
+          </w14:textOutline>
+        </w:rPr>
+        <w:t xml:space="preserve"> value = $(</w:t>
+      </w:r>
+      <w:r>
+        <w:rPr>
+          <w:bCs/>
+          <w:i/>
+          <w:iCs/>
+          <w:color w:val="000000" w:themeColor="text1"/>
+          <w:sz w:val="24"/>
+          <w:szCs w:val="24"/>
+          <w14:shadow w14:blurRad="38100" w14:dist="19050" w14:dir="2700000" w14:sx="100000" w14:sy="100000" w14:kx="0" w14:ky="0" w14:algn="tl">
+            <w14:schemeClr w14:val="dk1">
+              <w14:alpha w14:val="60000"/>
+            </w14:schemeClr>
+          </w14:shadow>
+          <w14:textOutline w14:w="0" w14:cap="flat" w14:cmpd="sng" w14:algn="ctr">
+            <w14:noFill/>
+            <w14:prstDash w14:val="solid"/>
+            <w14:round/>
+          </w14:textOutline>
+        </w:rPr>
+        <w:t>this</w:t>
+      </w:r>
+      <w:proofErr w:type="gramStart"/>
+      <w:r>
+        <w:rPr>
+          <w:bCs/>
+          <w:color w:val="000000" w:themeColor="text1"/>
+          <w:sz w:val="24"/>
+          <w:szCs w:val="24"/>
+          <w14:shadow w14:blurRad="38100" w14:dist="19050" w14:dir="2700000" w14:sx="100000" w14:sy="100000" w14:kx="0" w14:ky="0" w14:algn="tl">
+            <w14:schemeClr w14:val="dk1">
+              <w14:alpha w14:val="60000"/>
+            </w14:schemeClr>
+          </w14:shadow>
+          <w14:textOutline w14:w="0" w14:cap="flat" w14:cmpd="sng" w14:algn="ctr">
+            <w14:noFill/>
+            <w14:prstDash w14:val="solid"/>
+            <w14:round/>
+          </w14:textOutline>
+        </w:rPr>
+        <w:t>).</w:t>
+      </w:r>
+      <w:proofErr w:type="spellStart"/>
+      <w:r>
+        <w:rPr>
+          <w:bCs/>
+          <w:color w:val="000000" w:themeColor="text1"/>
+          <w:sz w:val="24"/>
+          <w:szCs w:val="24"/>
+          <w14:shadow w14:blurRad="38100" w14:dist="19050" w14:dir="2700000" w14:sx="100000" w14:sy="100000" w14:kx="0" w14:ky="0" w14:algn="tl">
+            <w14:schemeClr w14:val="dk1">
+              <w14:alpha w14:val="60000"/>
+            </w14:schemeClr>
+          </w14:shadow>
+          <w14:textOutline w14:w="0" w14:cap="flat" w14:cmpd="sng" w14:algn="ctr">
+            <w14:noFill/>
+            <w14:prstDash w14:val="solid"/>
+            <w14:round/>
+          </w14:textOutline>
+        </w:rPr>
+        <w:t>val</w:t>
+      </w:r>
+      <w:proofErr w:type="spellEnd"/>
+      <w:proofErr w:type="gramEnd"/>
+      <w:r>
+        <w:rPr>
+          <w:bCs/>
+          <w:color w:val="000000" w:themeColor="text1"/>
+          <w:sz w:val="24"/>
+          <w:szCs w:val="24"/>
+          <w14:shadow w14:blurRad="38100" w14:dist="19050" w14:dir="2700000" w14:sx="100000" w14:sy="100000" w14:kx="0" w14:ky="0" w14:algn="tl">
+            <w14:schemeClr w14:val="dk1">
+              <w14:alpha w14:val="60000"/>
+            </w14:schemeClr>
+          </w14:shadow>
+          <w14:textOutline w14:w="0" w14:cap="flat" w14:cmpd="sng" w14:algn="ctr">
+            <w14:noFill/>
+            <w14:prstDash w14:val="solid"/>
+            <w14:round/>
+          </w14:textOutline>
+        </w:rPr>
+        <w:t>().</w:t>
+      </w:r>
+      <w:proofErr w:type="spellStart"/>
+      <w:r>
+        <w:rPr>
+          <w:bCs/>
+          <w:color w:val="000000" w:themeColor="text1"/>
+          <w:sz w:val="24"/>
+          <w:szCs w:val="24"/>
+          <w14:shadow w14:blurRad="38100" w14:dist="19050" w14:dir="2700000" w14:sx="100000" w14:sy="100000" w14:kx="0" w14:ky="0" w14:algn="tl">
+            <w14:schemeClr w14:val="dk1">
+              <w14:alpha w14:val="60000"/>
+            </w14:schemeClr>
+          </w14:shadow>
+          <w14:textOutline w14:w="0" w14:cap="flat" w14:cmpd="sng" w14:algn="ctr">
+            <w14:noFill/>
+            <w14:prstDash w14:val="solid"/>
+            <w14:round/>
+          </w14:textOutline>
+        </w:rPr>
+        <w:t>toLowerCase</w:t>
+      </w:r>
+      <w:proofErr w:type="spellEnd"/>
+      <w:r>
+        <w:rPr>
+          <w:bCs/>
+          <w:color w:val="000000" w:themeColor="text1"/>
+          <w:sz w:val="24"/>
+          <w:szCs w:val="24"/>
+          <w14:shadow w14:blurRad="38100" w14:dist="19050" w14:dir="2700000" w14:sx="100000" w14:sy="100000" w14:kx="0" w14:ky="0" w14:algn="tl">
+            <w14:schemeClr w14:val="dk1">
+              <w14:alpha w14:val="60000"/>
+            </w14:schemeClr>
+          </w14:shadow>
+          <w14:textOutline w14:w="0" w14:cap="flat" w14:cmpd="sng" w14:algn="ctr">
+            <w14:noFill/>
+            <w14:prstDash w14:val="solid"/>
+            <w14:round/>
+          </w14:textOutline>
+        </w:rPr>
+        <w:t>();</w:t>
+      </w:r>
+    </w:p>
+    <w:p>
+      <w:pPr>
+        <w:shd w:val="clear" w:color="auto" w:fill="FFFFFF"/>
+        <w:spacing w:before="150" w:after="150" w:line="240" w:lineRule="auto"/>
+        <w:outlineLvl w:val="1"/>
+        <w:rPr>
+          <w:bCs/>
+          <w:color w:val="000000" w:themeColor="text1"/>
+          <w:sz w:val="24"/>
+          <w:szCs w:val="24"/>
+          <w14:shadow w14:blurRad="38100" w14:dist="19050" w14:dir="2700000" w14:sx="100000" w14:sy="100000" w14:kx="0" w14:ky="0" w14:algn="tl">
+            <w14:schemeClr w14:val="dk1">
+              <w14:alpha w14:val="60000"/>
+            </w14:schemeClr>
+          </w14:shadow>
+          <w14:textOutline w14:w="0" w14:cap="flat" w14:cmpd="sng" w14:algn="ctr">
+            <w14:noFill/>
+            <w14:prstDash w14:val="solid"/>
+            <w14:round/>
+          </w14:textOutline>
+        </w:rPr>
+      </w:pPr>
+      <w:r>
+        <w:rPr>
+          <w:bCs/>
+          <w:color w:val="000000" w:themeColor="text1"/>
+          <w:sz w:val="24"/>
+          <w:szCs w:val="24"/>
+          <w14:shadow w14:blurRad="38100" w14:dist="19050" w14:dir="2700000" w14:sx="100000" w14:sy="100000" w14:kx="0" w14:ky="0" w14:algn="tl">
+            <w14:schemeClr w14:val="dk1">
+              <w14:alpha w14:val="60000"/>
+            </w14:schemeClr>
+          </w14:shadow>
+          <w14:textOutline w14:w="0" w14:cap="flat" w14:cmpd="sng" w14:algn="ctr">
+            <w14:noFill/>
+            <w14:prstDash w14:val="solid"/>
+            <w14:round/>
+          </w14:textOutline>
+        </w:rPr>
+        <w:t>      $("#</w:t>
+      </w:r>
+      <w:proofErr w:type="spellStart"/>
+      <w:r>
+        <w:rPr>
+          <w:bCs/>
+          <w:color w:val="000000" w:themeColor="text1"/>
+          <w:sz w:val="24"/>
+          <w:szCs w:val="24"/>
+          <w14:shadow w14:blurRad="38100" w14:dist="19050" w14:dir="2700000" w14:sx="100000" w14:sy="100000" w14:kx="0" w14:ky="0" w14:algn="tl">
+            <w14:schemeClr w14:val="dk1">
+              <w14:alpha w14:val="60000"/>
+            </w14:schemeClr>
+          </w14:shadow>
+          <w14:textOutline w14:w="0" w14:cap="flat" w14:cmpd="sng" w14:algn="ctr">
+            <w14:noFill/>
+            <w14:prstDash w14:val="solid"/>
+            <w14:round/>
+          </w14:textOutline>
+        </w:rPr>
+        <w:t>myTable</w:t>
+      </w:r>
+      <w:proofErr w:type="spellEnd"/>
+      <w:r>
+        <w:rPr>
+          <w:bCs/>
+          <w:color w:val="000000" w:themeColor="text1"/>
+          <w:sz w:val="24"/>
+          <w:szCs w:val="24"/>
+          <w14:shadow w14:blurRad="38100" w14:dist="19050" w14:dir="2700000" w14:sx="100000" w14:sy="100000" w14:kx="0" w14:ky="0" w14:algn="tl">
+            <w14:schemeClr w14:val="dk1">
+              <w14:alpha w14:val="60000"/>
+            </w14:schemeClr>
+          </w14:shadow>
+          <w14:textOutline w14:w="0" w14:cap="flat" w14:cmpd="sng" w14:algn="ctr">
+            <w14:noFill/>
+            <w14:prstDash w14:val="solid"/>
+            <w14:round/>
+          </w14:textOutline>
+        </w:rPr>
+        <w:t xml:space="preserve"> tr"</w:t>
+      </w:r>
+      <w:proofErr w:type="gramStart"/>
+      <w:r>
+        <w:rPr>
+          <w:bCs/>
+          <w:color w:val="000000" w:themeColor="text1"/>
+          <w:sz w:val="24"/>
+          <w:szCs w:val="24"/>
+          <w14:shadow w14:blurRad="38100" w14:dist="19050" w14:dir="2700000" w14:sx="100000" w14:sy="100000" w14:kx="0" w14:ky="0" w14:algn="tl">
+            <w14:schemeClr w14:val="dk1">
+              <w14:alpha w14:val="60000"/>
+            </w14:schemeClr>
+          </w14:shadow>
+          <w14:textOutline w14:w="0" w14:cap="flat" w14:cmpd="sng" w14:algn="ctr">
+            <w14:noFill/>
+            <w14:prstDash w14:val="solid"/>
+            <w14:round/>
+          </w14:textOutline>
+        </w:rPr>
+        <w:t>).filter</w:t>
+      </w:r>
+      <w:proofErr w:type="gramEnd"/>
+      <w:r>
+        <w:rPr>
+          <w:bCs/>
+          <w:color w:val="000000" w:themeColor="text1"/>
+          <w:sz w:val="24"/>
+          <w:szCs w:val="24"/>
+          <w14:shadow w14:blurRad="38100" w14:dist="19050" w14:dir="2700000" w14:sx="100000" w14:sy="100000" w14:kx="0" w14:ky="0" w14:algn="tl">
+            <w14:schemeClr w14:val="dk1">
+              <w14:alpha w14:val="60000"/>
+            </w14:schemeClr>
+          </w14:shadow>
+          <w14:textOutline w14:w="0" w14:cap="flat" w14:cmpd="sng" w14:algn="ctr">
+            <w14:noFill/>
+            <w14:prstDash w14:val="solid"/>
+            <w14:round/>
+          </w14:textOutline>
+        </w:rPr>
+        <w:t>(</w:t>
+      </w:r>
+      <w:r>
+        <w:rPr>
+          <w:bCs/>
+          <w:i/>
+          <w:iCs/>
+          <w:color w:val="000000" w:themeColor="text1"/>
+          <w:sz w:val="24"/>
+          <w:szCs w:val="24"/>
+          <w14:shadow w14:blurRad="38100" w14:dist="19050" w14:dir="2700000" w14:sx="100000" w14:sy="100000" w14:kx="0" w14:ky="0" w14:algn="tl">
+            <w14:schemeClr w14:val="dk1">
+              <w14:alpha w14:val="60000"/>
+            </w14:schemeClr>
+          </w14:shadow>
+          <w14:textOutline w14:w="0" w14:cap="flat" w14:cmpd="sng" w14:algn="ctr">
+            <w14:noFill/>
+            <w14:prstDash w14:val="solid"/>
+            <w14:round/>
+          </w14:textOutline>
+        </w:rPr>
+        <w:t>function</w:t>
+      </w:r>
+      <w:r>
+        <w:rPr>
+          <w:bCs/>
+          <w:color w:val="000000" w:themeColor="text1"/>
+          <w:sz w:val="24"/>
+          <w:szCs w:val="24"/>
+          <w14:shadow w14:blurRad="38100" w14:dist="19050" w14:dir="2700000" w14:sx="100000" w14:sy="100000" w14:kx="0" w14:ky="0" w14:algn="tl">
+            <w14:schemeClr w14:val="dk1">
+              <w14:alpha w14:val="60000"/>
+            </w14:schemeClr>
+          </w14:shadow>
+          <w14:textOutline w14:w="0" w14:cap="flat" w14:cmpd="sng" w14:algn="ctr">
+            <w14:noFill/>
+            <w14:prstDash w14:val="solid"/>
+            <w14:round/>
+          </w14:textOutline>
+        </w:rPr>
+        <w:t>() {</w:t>
+      </w:r>
+    </w:p>
+    <w:p>
+      <w:pPr>
+        <w:shd w:val="clear" w:color="auto" w:fill="FFFFFF"/>
+        <w:spacing w:before="150" w:after="150" w:line="240" w:lineRule="auto"/>
+        <w:outlineLvl w:val="1"/>
+        <w:rPr>
+          <w:bCs/>
+          <w:color w:val="000000" w:themeColor="text1"/>
+          <w:sz w:val="24"/>
+          <w:szCs w:val="24"/>
+          <w14:shadow w14:blurRad="38100" w14:dist="19050" w14:dir="2700000" w14:sx="100000" w14:sy="100000" w14:kx="0" w14:ky="0" w14:algn="tl">
+            <w14:schemeClr w14:val="dk1">
+              <w14:alpha w14:val="60000"/>
+            </w14:schemeClr>
+          </w14:shadow>
+          <w14:textOutline w14:w="0" w14:cap="flat" w14:cmpd="sng" w14:algn="ctr">
+            <w14:noFill/>
+            <w14:prstDash w14:val="solid"/>
+            <w14:round/>
+          </w14:textOutline>
+        </w:rPr>
+      </w:pPr>
+      <w:r>
+        <w:rPr>
+          <w:bCs/>
+          <w:color w:val="000000" w:themeColor="text1"/>
+          <w:sz w:val="24"/>
+          <w:szCs w:val="24"/>
+          <w14:shadow w14:blurRad="38100" w14:dist="19050" w14:dir="2700000" w14:sx="100000" w14:sy="100000" w14:kx="0" w14:ky="0" w14:algn="tl">
+            <w14:schemeClr w14:val="dk1">
+              <w14:alpha w14:val="60000"/>
+            </w14:schemeClr>
+          </w14:shadow>
+          <w14:textOutline w14:w="0" w14:cap="flat" w14:cmpd="sng" w14:algn="ctr">
+            <w14:noFill/>
+            <w14:prstDash w14:val="solid"/>
+            <w14:round/>
+          </w14:textOutline>
+        </w:rPr>
+        <w:t>        $(</w:t>
+      </w:r>
+      <w:r>
+        <w:rPr>
+          <w:bCs/>
+          <w:i/>
+          <w:iCs/>
+          <w:color w:val="000000" w:themeColor="text1"/>
+          <w:sz w:val="24"/>
+          <w:szCs w:val="24"/>
+          <w14:shadow w14:blurRad="38100" w14:dist="19050" w14:dir="2700000" w14:sx="100000" w14:sy="100000" w14:kx="0" w14:ky="0" w14:algn="tl">
+            <w14:schemeClr w14:val="dk1">
+              <w14:alpha w14:val="60000"/>
+            </w14:schemeClr>
+          </w14:shadow>
+          <w14:textOutline w14:w="0" w14:cap="flat" w14:cmpd="sng" w14:algn="ctr">
+            <w14:noFill/>
+            <w14:prstDash w14:val="solid"/>
+            <w14:round/>
+          </w14:textOutline>
+        </w:rPr>
+        <w:t>this</w:t>
+      </w:r>
+      <w:proofErr w:type="gramStart"/>
+      <w:r>
+        <w:rPr>
+          <w:bCs/>
+          <w:color w:val="000000" w:themeColor="text1"/>
+          <w:sz w:val="24"/>
+          <w:szCs w:val="24"/>
+          <w14:shadow w14:blurRad="38100" w14:dist="19050" w14:dir="2700000" w14:sx="100000" w14:sy="100000" w14:kx="0" w14:ky="0" w14:algn="tl">
+            <w14:schemeClr w14:val="dk1">
+              <w14:alpha w14:val="60000"/>
+            </w14:schemeClr>
+          </w14:shadow>
+          <w14:textOutline w14:w="0" w14:cap="flat" w14:cmpd="sng" w14:algn="ctr">
+            <w14:noFill/>
+            <w14:prstDash w14:val="solid"/>
+            <w14:round/>
+          </w14:textOutline>
+        </w:rPr>
+        <w:t>).toggle</w:t>
+      </w:r>
+      <w:proofErr w:type="gramEnd"/>
+      <w:r>
+        <w:rPr>
+          <w:bCs/>
+          <w:color w:val="000000" w:themeColor="text1"/>
+          <w:sz w:val="24"/>
+          <w:szCs w:val="24"/>
+          <w14:shadow w14:blurRad="38100" w14:dist="19050" w14:dir="2700000" w14:sx="100000" w14:sy="100000" w14:kx="0" w14:ky="0" w14:algn="tl">
+            <w14:schemeClr w14:val="dk1">
+              <w14:alpha w14:val="60000"/>
+            </w14:schemeClr>
+          </w14:shadow>
+          <w14:textOutline w14:w="0" w14:cap="flat" w14:cmpd="sng" w14:algn="ctr">
+            <w14:noFill/>
+            <w14:prstDash w14:val="solid"/>
+            <w14:round/>
+          </w14:textOutline>
+        </w:rPr>
+        <w:t>($(</w:t>
+      </w:r>
+      <w:r>
+        <w:rPr>
+          <w:bCs/>
+          <w:i/>
+          <w:iCs/>
+          <w:color w:val="000000" w:themeColor="text1"/>
+          <w:sz w:val="24"/>
+          <w:szCs w:val="24"/>
+          <w14:shadow w14:blurRad="38100" w14:dist="19050" w14:dir="2700000" w14:sx="100000" w14:sy="100000" w14:kx="0" w14:ky="0" w14:algn="tl">
+            <w14:schemeClr w14:val="dk1">
+              <w14:alpha w14:val="60000"/>
+            </w14:schemeClr>
+          </w14:shadow>
+          <w14:textOutline w14:w="0" w14:cap="flat" w14:cmpd="sng" w14:algn="ctr">
+            <w14:noFill/>
+            <w14:prstDash w14:val="solid"/>
+            <w14:round/>
+          </w14:textOutline>
+        </w:rPr>
+        <w:t>this</w:t>
+      </w:r>
+      <w:r>
+        <w:rPr>
+          <w:bCs/>
+          <w:color w:val="000000" w:themeColor="text1"/>
+          <w:sz w:val="24"/>
+          <w:szCs w:val="24"/>
+          <w14:shadow w14:blurRad="38100" w14:dist="19050" w14:dir="2700000" w14:sx="100000" w14:sy="100000" w14:kx="0" w14:ky="0" w14:algn="tl">
+            <w14:schemeClr w14:val="dk1">
+              <w14:alpha w14:val="60000"/>
+            </w14:schemeClr>
+          </w14:shadow>
+          <w14:textOutline w14:w="0" w14:cap="flat" w14:cmpd="sng" w14:algn="ctr">
+            <w14:noFill/>
+            <w14:prstDash w14:val="solid"/>
+            <w14:round/>
+          </w14:textOutline>
+        </w:rPr>
+        <w:t>).text().</w:t>
+      </w:r>
+      <w:proofErr w:type="spellStart"/>
+      <w:r>
+        <w:rPr>
+          <w:bCs/>
+          <w:color w:val="000000" w:themeColor="text1"/>
+          <w:sz w:val="24"/>
+          <w:szCs w:val="24"/>
+          <w14:shadow w14:blurRad="38100" w14:dist="19050" w14:dir="2700000" w14:sx="100000" w14:sy="100000" w14:kx="0" w14:ky="0" w14:algn="tl">
+            <w14:schemeClr w14:val="dk1">
+              <w14:alpha w14:val="60000"/>
+            </w14:schemeClr>
+          </w14:shadow>
+          <w14:textOutline w14:w="0" w14:cap="flat" w14:cmpd="sng" w14:algn="ctr">
+            <w14:noFill/>
+            <w14:prstDash w14:val="solid"/>
+            <w14:round/>
+          </w14:textOutline>
+        </w:rPr>
+        <w:t>toLowerCase</w:t>
+      </w:r>
+      <w:proofErr w:type="spellEnd"/>
+      <w:r>
+        <w:rPr>
+          <w:bCs/>
+          <w:color w:val="000000" w:themeColor="text1"/>
+          <w:sz w:val="24"/>
+          <w:szCs w:val="24"/>
+          <w14:shadow w14:blurRad="38100" w14:dist="19050" w14:dir="2700000" w14:sx="100000" w14:sy="100000" w14:kx="0" w14:ky="0" w14:algn="tl">
+            <w14:schemeClr w14:val="dk1">
+              <w14:alpha w14:val="60000"/>
+            </w14:schemeClr>
+          </w14:shadow>
+          <w14:textOutline w14:w="0" w14:cap="flat" w14:cmpd="sng" w14:algn="ctr">
+            <w14:noFill/>
+            <w14:prstDash w14:val="solid"/>
+            <w14:round/>
+          </w14:textOutline>
+        </w:rPr>
+        <w:t>().</w:t>
+      </w:r>
+      <w:proofErr w:type="spellStart"/>
+      <w:r>
+        <w:rPr>
+          <w:bCs/>
+          <w:color w:val="000000" w:themeColor="text1"/>
+          <w:sz w:val="24"/>
+          <w:szCs w:val="24"/>
+          <w14:shadow w14:blurRad="38100" w14:dist="19050" w14:dir="2700000" w14:sx="100000" w14:sy="100000" w14:kx="0" w14:ky="0" w14:algn="tl">
+            <w14:schemeClr w14:val="dk1">
+              <w14:alpha w14:val="60000"/>
+            </w14:schemeClr>
+          </w14:shadow>
+          <w14:textOutline w14:w="0" w14:cap="flat" w14:cmpd="sng" w14:algn="ctr">
+            <w14:noFill/>
+            <w14:prstDash w14:val="solid"/>
+            <w14:round/>
+          </w14:textOutline>
+        </w:rPr>
+        <w:t>indexOf</w:t>
+      </w:r>
+      <w:proofErr w:type="spellEnd"/>
+      <w:r>
+        <w:rPr>
+          <w:bCs/>
+          <w:color w:val="000000" w:themeColor="text1"/>
+          <w:sz w:val="24"/>
+          <w:szCs w:val="24"/>
+          <w14:shadow w14:blurRad="38100" w14:dist="19050" w14:dir="2700000" w14:sx="100000" w14:sy="100000" w14:kx="0" w14:ky="0" w14:algn="tl">
+            <w14:schemeClr w14:val="dk1">
+              <w14:alpha w14:val="60000"/>
+            </w14:schemeClr>
+          </w14:shadow>
+          <w14:textOutline w14:w="0" w14:cap="flat" w14:cmpd="sng" w14:algn="ctr">
+            <w14:noFill/>
+            <w14:prstDash w14:val="solid"/>
+            <w14:round/>
+          </w14:textOutline>
+        </w:rPr>
+        <w:t>(value) &gt; -1)</w:t>
+      </w:r>
+    </w:p>
+    <w:p>
+      <w:pPr>
+        <w:shd w:val="clear" w:color="auto" w:fill="FFFFFF"/>
+        <w:spacing w:before="150" w:after="150" w:line="240" w:lineRule="auto"/>
+        <w:outlineLvl w:val="1"/>
+        <w:rPr>
+          <w:bCs/>
+          <w:color w:val="000000" w:themeColor="text1"/>
+          <w:sz w:val="24"/>
+          <w:szCs w:val="24"/>
+          <w14:shadow w14:blurRad="38100" w14:dist="19050" w14:dir="2700000" w14:sx="100000" w14:sy="100000" w14:kx="0" w14:ky="0" w14:algn="tl">
+            <w14:schemeClr w14:val="dk1">
+              <w14:alpha w14:val="60000"/>
+            </w14:schemeClr>
+          </w14:shadow>
+          <w14:textOutline w14:w="0" w14:cap="flat" w14:cmpd="sng" w14:algn="ctr">
+            <w14:noFill/>
+            <w14:prstDash w14:val="solid"/>
+            <w14:round/>
+          </w14:textOutline>
+        </w:rPr>
+      </w:pPr>
+      <w:r>
+        <w:rPr>
+          <w:bCs/>
+          <w:color w:val="000000" w:themeColor="text1"/>
+          <w:sz w:val="24"/>
+          <w:szCs w:val="24"/>
+          <w14:shadow w14:blurRad="38100" w14:dist="19050" w14:dir="2700000" w14:sx="100000" w14:sy="100000" w14:kx="0" w14:ky="0" w14:algn="tl">
+            <w14:schemeClr w14:val="dk1">
+              <w14:alpha w14:val="60000"/>
+            </w14:schemeClr>
+          </w14:shadow>
+          <w14:textOutline w14:w="0" w14:cap="flat" w14:cmpd="sng" w14:algn="ctr">
+            <w14:noFill/>
+            <w14:prstDash w14:val="solid"/>
+            <w14:round/>
+          </w14:textOutline>
+        </w:rPr>
+        <w:lastRenderedPageBreak/>
+        <w:t>      });</w:t>
+      </w:r>
+    </w:p>
+    <w:p>
+      <w:pPr>
+        <w:shd w:val="clear" w:color="auto" w:fill="FFFFFF"/>
+        <w:spacing w:before="150" w:after="150" w:line="240" w:lineRule="auto"/>
+        <w:outlineLvl w:val="1"/>
+        <w:rPr>
+          <w:bCs/>
+          <w:color w:val="000000" w:themeColor="text1"/>
+          <w:sz w:val="24"/>
+          <w:szCs w:val="24"/>
+          <w14:shadow w14:blurRad="38100" w14:dist="19050" w14:dir="2700000" w14:sx="100000" w14:sy="100000" w14:kx="0" w14:ky="0" w14:algn="tl">
+            <w14:schemeClr w14:val="dk1">
+              <w14:alpha w14:val="60000"/>
+            </w14:schemeClr>
+          </w14:shadow>
+          <w14:textOutline w14:w="0" w14:cap="flat" w14:cmpd="sng" w14:algn="ctr">
+            <w14:noFill/>
+            <w14:prstDash w14:val="solid"/>
+            <w14:round/>
+          </w14:textOutline>
+        </w:rPr>
+      </w:pPr>
+      <w:r>
+        <w:rPr>
+          <w:bCs/>
+          <w:color w:val="000000" w:themeColor="text1"/>
+          <w:sz w:val="24"/>
+          <w:szCs w:val="24"/>
+          <w14:shadow w14:blurRad="38100" w14:dist="19050" w14:dir="2700000" w14:sx="100000" w14:sy="100000" w14:kx="0" w14:ky="0" w14:algn="tl">
+            <w14:schemeClr w14:val="dk1">
+              <w14:alpha w14:val="60000"/>
+            </w14:schemeClr>
+          </w14:shadow>
+          <w14:textOutline w14:w="0" w14:cap="flat" w14:cmpd="sng" w14:algn="ctr">
+            <w14:noFill/>
+            <w14:prstDash w14:val="solid"/>
+            <w14:round/>
+          </w14:textOutline>
+        </w:rPr>
+        <w:t>    });</w:t>
+      </w:r>
+    </w:p>
+    <w:p>
+      <w:pPr>
+        <w:shd w:val="clear" w:color="auto" w:fill="FFFFFF"/>
+        <w:spacing w:before="150" w:after="150" w:line="240" w:lineRule="auto"/>
+        <w:outlineLvl w:val="1"/>
+        <w:rPr>
+          <w:bCs/>
+          <w:color w:val="000000" w:themeColor="text1"/>
+          <w:sz w:val="24"/>
+          <w:szCs w:val="24"/>
+          <w14:shadow w14:blurRad="38100" w14:dist="19050" w14:dir="2700000" w14:sx="100000" w14:sy="100000" w14:kx="0" w14:ky="0" w14:algn="tl">
+            <w14:schemeClr w14:val="dk1">
+              <w14:alpha w14:val="60000"/>
+            </w14:schemeClr>
+          </w14:shadow>
+          <w14:textOutline w14:w="0" w14:cap="flat" w14:cmpd="sng" w14:algn="ctr">
+            <w14:noFill/>
+            <w14:prstDash w14:val="solid"/>
+            <w14:round/>
+          </w14:textOutline>
+        </w:rPr>
+      </w:pPr>
+      <w:r>
+        <w:rPr>
+          <w:bCs/>
+          <w:color w:val="000000" w:themeColor="text1"/>
+          <w:sz w:val="24"/>
+          <w:szCs w:val="24"/>
+          <w14:shadow w14:blurRad="38100" w14:dist="19050" w14:dir="2700000" w14:sx="100000" w14:sy="100000" w14:kx="0" w14:ky="0" w14:algn="tl">
+            <w14:schemeClr w14:val="dk1">
+              <w14:alpha w14:val="60000"/>
+            </w14:schemeClr>
+          </w14:shadow>
+          <w14:textOutline w14:w="0" w14:cap="flat" w14:cmpd="sng" w14:algn="ctr">
+            <w14:noFill/>
+            <w14:prstDash w14:val="solid"/>
+            <w14:round/>
+          </w14:textOutline>
+        </w:rPr>
+        <w:t>  });</w:t>
+      </w:r>
+    </w:p>
+    <w:p>
+      <w:pPr>
+        <w:rPr>
+          <w:bCs/>
+          <w:color w:val="000000" w:themeColor="text1"/>
+          <w:sz w:val="24"/>
+          <w:szCs w:val="24"/>
+          <w14:shadow w14:blurRad="38100" w14:dist="19050" w14:dir="2700000" w14:sx="100000" w14:sy="100000" w14:kx="0" w14:ky="0" w14:algn="tl">
+            <w14:schemeClr w14:val="dk1">
+              <w14:alpha w14:val="60000"/>
+            </w14:schemeClr>
+          </w14:shadow>
+          <w14:textOutline w14:w="0" w14:cap="flat" w14:cmpd="sng" w14:algn="ctr">
+            <w14:noFill/>
+            <w14:prstDash w14:val="solid"/>
+            <w14:round/>
+          </w14:textOutline>
+        </w:rPr>
+      </w:pPr>
+      <w:r>
+        <w:rPr>
+          <w:bCs/>
+          <w:color w:val="000000" w:themeColor="text1"/>
+          <w:sz w:val="24"/>
+          <w:szCs w:val="24"/>
+          <w14:shadow w14:blurRad="38100" w14:dist="19050" w14:dir="2700000" w14:sx="100000" w14:sy="100000" w14:kx="0" w14:ky="0" w14:algn="tl">
+            <w14:schemeClr w14:val="dk1">
+              <w14:alpha w14:val="60000"/>
+            </w14:schemeClr>
+          </w14:shadow>
+          <w14:textOutline w14:w="0" w14:cap="flat" w14:cmpd="sng" w14:algn="ctr">
+            <w14:noFill/>
+            <w14:prstDash w14:val="solid"/>
+            <w14:round/>
+          </w14:textOutline>
+        </w:rPr>
+        <w:br w:type="page"/>
+      </w:r>
+    </w:p>
+    <w:p>
+      <w:pPr>
+        <w:shd w:val="clear" w:color="auto" w:fill="FFFFFF"/>
+        <w:spacing w:before="150" w:after="150" w:line="240" w:lineRule="auto"/>
+        <w:outlineLvl w:val="1"/>
+        <w:rPr>
+          <w:rFonts w:ascii="Segoe UI" w:eastAsia="Times New Roman" w:hAnsi="Segoe UI" w:cs="Segoe UI"/>
+          <w:color w:val="000000"/>
+          <w:kern w:val="0"/>
+          <w:sz w:val="48"/>
+          <w:szCs w:val="48"/>
+          <w:lang w:eastAsia="en-IN"/>
+          <w14:ligatures w14:val="none"/>
+        </w:rPr>
+      </w:pPr>
+      <w:proofErr w:type="spellStart"/>
+      <w:r>
+        <w:rPr>
+          <w:rFonts w:ascii="Segoe UI" w:eastAsia="Times New Roman" w:hAnsi="Segoe UI" w:cs="Segoe UI"/>
+          <w:color w:val="000000"/>
+          <w:kern w:val="0"/>
+          <w:sz w:val="48"/>
+          <w:szCs w:val="48"/>
+          <w:lang w:eastAsia="en-IN"/>
+          <w14:ligatures w14:val="none"/>
+        </w:rPr>
+        <w:lastRenderedPageBreak/>
+        <w:t>JQuery</w:t>
+      </w:r>
+      <w:proofErr w:type="spellEnd"/>
+      <w:r>
+        <w:rPr>
+          <w:rFonts w:ascii="Segoe UI" w:eastAsia="Times New Roman" w:hAnsi="Segoe UI" w:cs="Segoe UI"/>
+          <w:color w:val="000000"/>
+          <w:kern w:val="0"/>
+          <w:sz w:val="48"/>
+          <w:szCs w:val="48"/>
+          <w:lang w:eastAsia="en-IN"/>
+          <w14:ligatures w14:val="none"/>
+        </w:rPr>
+        <w:t xml:space="preserve"> First Ajax Api Call</w:t>
+      </w:r>
+    </w:p>
+    <w:p>
+      <w:pPr>
+        <w:shd w:val="clear" w:color="auto" w:fill="FFFFFF"/>
+        <w:spacing w:before="150" w:after="150" w:line="240" w:lineRule="auto"/>
+        <w:outlineLvl w:val="1"/>
+        <w:rPr>
+          <w:rFonts w:ascii="Segoe UI" w:eastAsia="Times New Roman" w:hAnsi="Segoe UI" w:cs="Segoe UI"/>
+          <w:color w:val="000000"/>
+          <w:kern w:val="0"/>
+          <w:sz w:val="48"/>
+          <w:szCs w:val="48"/>
+          <w:lang w:eastAsia="en-IN"/>
+          <w14:ligatures w14:val="none"/>
+        </w:rPr>
+      </w:pPr>
+    </w:p>
+    <w:p>
+      <w:pPr>
+        <w:shd w:val="clear" w:color="auto" w:fill="FFFFFF"/>
+        <w:spacing w:before="150" w:after="150" w:line="240" w:lineRule="auto"/>
+        <w:outlineLvl w:val="1"/>
+        <w:rPr>
+          <w:bCs/>
+          <w:color w:val="000000" w:themeColor="text1"/>
+          <w:sz w:val="24"/>
+          <w:szCs w:val="24"/>
+          <w14:shadow w14:blurRad="38100" w14:dist="19050" w14:dir="2700000" w14:sx="100000" w14:sy="100000" w14:kx="0" w14:ky="0" w14:algn="tl">
+            <w14:schemeClr w14:val="dk1">
+              <w14:alpha w14:val="60000"/>
+            </w14:schemeClr>
+          </w14:shadow>
+          <w14:textOutline w14:w="0" w14:cap="flat" w14:cmpd="sng" w14:algn="ctr">
+            <w14:noFill/>
+            <w14:prstDash w14:val="solid"/>
+            <w14:round/>
+          </w14:textOutline>
+        </w:rPr>
+      </w:pPr>
+      <w:proofErr w:type="gramStart"/>
+      <w:r>
+        <w:rPr>
+          <w:bCs/>
+          <w:color w:val="000000" w:themeColor="text1"/>
+          <w:sz w:val="24"/>
+          <w:szCs w:val="24"/>
+          <w14:shadow w14:blurRad="38100" w14:dist="19050" w14:dir="2700000" w14:sx="100000" w14:sy="100000" w14:kx="0" w14:ky="0" w14:algn="tl">
+            <w14:schemeClr w14:val="dk1">
+              <w14:alpha w14:val="60000"/>
+            </w14:schemeClr>
+          </w14:shadow>
+          <w14:textOutline w14:w="0" w14:cap="flat" w14:cmpd="sng" w14:algn="ctr">
+            <w14:noFill/>
+            <w14:prstDash w14:val="solid"/>
+            <w14:round/>
+          </w14:textOutline>
+        </w:rPr>
+        <w:t>$.ajax</w:t>
+      </w:r>
+      <w:proofErr w:type="gramEnd"/>
+      <w:r>
+        <w:rPr>
+          <w:bCs/>
+          <w:color w:val="000000" w:themeColor="text1"/>
+          <w:sz w:val="24"/>
+          <w:szCs w:val="24"/>
+          <w14:shadow w14:blurRad="38100" w14:dist="19050" w14:dir="2700000" w14:sx="100000" w14:sy="100000" w14:kx="0" w14:ky="0" w14:algn="tl">
+            <w14:schemeClr w14:val="dk1">
+              <w14:alpha w14:val="60000"/>
+            </w14:schemeClr>
+          </w14:shadow>
+          <w14:textOutline w14:w="0" w14:cap="flat" w14:cmpd="sng" w14:algn="ctr">
+            <w14:noFill/>
+            <w14:prstDash w14:val="solid"/>
+            <w14:round/>
+          </w14:textOutline>
+        </w:rPr>
+        <w:t>({</w:t>
+      </w:r>
+    </w:p>
+    <w:p>
+      <w:pPr>
+        <w:shd w:val="clear" w:color="auto" w:fill="FFFFFF"/>
+        <w:spacing w:before="150" w:after="150" w:line="240" w:lineRule="auto"/>
+        <w:outlineLvl w:val="1"/>
+        <w:rPr>
+          <w:bCs/>
+          <w:color w:val="000000" w:themeColor="text1"/>
+          <w:sz w:val="24"/>
+          <w:szCs w:val="24"/>
+          <w14:shadow w14:blurRad="38100" w14:dist="19050" w14:dir="2700000" w14:sx="100000" w14:sy="100000" w14:kx="0" w14:ky="0" w14:algn="tl">
+            <w14:schemeClr w14:val="dk1">
+              <w14:alpha w14:val="60000"/>
+            </w14:schemeClr>
+          </w14:shadow>
+          <w14:textOutline w14:w="0" w14:cap="flat" w14:cmpd="sng" w14:algn="ctr">
+            <w14:noFill/>
+            <w14:prstDash w14:val="solid"/>
+            <w14:round/>
+          </w14:textOutline>
+        </w:rPr>
+      </w:pPr>
+      <w:r>
+        <w:rPr>
+          <w:bCs/>
+          <w:color w:val="000000" w:themeColor="text1"/>
+          <w:sz w:val="24"/>
+          <w:szCs w:val="24"/>
+          <w14:shadow w14:blurRad="38100" w14:dist="19050" w14:dir="2700000" w14:sx="100000" w14:sy="100000" w14:kx="0" w14:ky="0" w14:algn="tl">
+            <w14:schemeClr w14:val="dk1">
+              <w14:alpha w14:val="60000"/>
+            </w14:schemeClr>
+          </w14:shadow>
+          <w14:textOutline w14:w="0" w14:cap="flat" w14:cmpd="sng" w14:algn="ctr">
+            <w14:noFill/>
+            <w14:prstDash w14:val="solid"/>
+            <w14:round/>
+          </w14:textOutline>
+        </w:rPr>
+        <w:t>    type: 'GET',</w:t>
+      </w:r>
+    </w:p>
+    <w:p>
+      <w:pPr>
+        <w:shd w:val="clear" w:color="auto" w:fill="FFFFFF"/>
+        <w:spacing w:before="150" w:after="150" w:line="240" w:lineRule="auto"/>
+        <w:outlineLvl w:val="1"/>
+        <w:rPr>
+          <w:bCs/>
+          <w:color w:val="000000" w:themeColor="text1"/>
+          <w:sz w:val="24"/>
+          <w:szCs w:val="24"/>
+          <w14:shadow w14:blurRad="38100" w14:dist="19050" w14:dir="2700000" w14:sx="100000" w14:sy="100000" w14:kx="0" w14:ky="0" w14:algn="tl">
+            <w14:schemeClr w14:val="dk1">
+              <w14:alpha w14:val="60000"/>
+            </w14:schemeClr>
+          </w14:shadow>
+          <w14:textOutline w14:w="0" w14:cap="flat" w14:cmpd="sng" w14:algn="ctr">
+            <w14:noFill/>
+            <w14:prstDash w14:val="solid"/>
+            <w14:round/>
+          </w14:textOutline>
+        </w:rPr>
+      </w:pPr>
+      <w:r>
+        <w:rPr>
+          <w:bCs/>
+          <w:color w:val="000000" w:themeColor="text1"/>
+          <w:sz w:val="24"/>
+          <w:szCs w:val="24"/>
+          <w14:shadow w14:blurRad="38100" w14:dist="19050" w14:dir="2700000" w14:sx="100000" w14:sy="100000" w14:kx="0" w14:ky="0" w14:algn="tl">
+            <w14:schemeClr w14:val="dk1">
+              <w14:alpha w14:val="60000"/>
+            </w14:schemeClr>
+          </w14:shadow>
+          <w14:textOutline w14:w="0" w14:cap="flat" w14:cmpd="sng" w14:algn="ctr">
+            <w14:noFill/>
+            <w14:prstDash w14:val="solid"/>
+            <w14:round/>
+          </w14:textOutline>
+        </w:rPr>
+        <w:t>    url: ('https://fakestoreapi.com/products'),</w:t>
+      </w:r>
+    </w:p>
+    <w:p>
+      <w:pPr>
+        <w:shd w:val="clear" w:color="auto" w:fill="FFFFFF"/>
+        <w:spacing w:before="150" w:after="150" w:line="240" w:lineRule="auto"/>
+        <w:outlineLvl w:val="1"/>
+        <w:rPr>
+          <w:bCs/>
+          <w:color w:val="000000" w:themeColor="text1"/>
+          <w:sz w:val="24"/>
+          <w:szCs w:val="24"/>
+          <w14:shadow w14:blurRad="38100" w14:dist="19050" w14:dir="2700000" w14:sx="100000" w14:sy="100000" w14:kx="0" w14:ky="0" w14:algn="tl">
+            <w14:schemeClr w14:val="dk1">
+              <w14:alpha w14:val="60000"/>
+            </w14:schemeClr>
+          </w14:shadow>
+          <w14:textOutline w14:w="0" w14:cap="flat" w14:cmpd="sng" w14:algn="ctr">
+            <w14:noFill/>
+            <w14:prstDash w14:val="solid"/>
+            <w14:round/>
+          </w14:textOutline>
+        </w:rPr>
+      </w:pPr>
+      <w:r>
+        <w:rPr>
+          <w:bCs/>
+          <w:color w:val="000000" w:themeColor="text1"/>
+          <w:sz w:val="24"/>
+          <w:szCs w:val="24"/>
+          <w14:shadow w14:blurRad="38100" w14:dist="19050" w14:dir="2700000" w14:sx="100000" w14:sy="100000" w14:kx="0" w14:ky="0" w14:algn="tl">
+            <w14:schemeClr w14:val="dk1">
+              <w14:alpha w14:val="60000"/>
+            </w14:schemeClr>
+          </w14:shadow>
+          <w14:textOutline w14:w="0" w14:cap="flat" w14:cmpd="sng" w14:algn="ctr">
+            <w14:noFill/>
+            <w14:prstDash w14:val="solid"/>
+            <w14:round/>
+          </w14:textOutline>
+        </w:rPr>
+        <w:t xml:space="preserve">    </w:t>
+      </w:r>
+      <w:proofErr w:type="spellStart"/>
+      <w:r>
+        <w:rPr>
+          <w:bCs/>
+          <w:color w:val="000000" w:themeColor="text1"/>
+          <w:sz w:val="24"/>
+          <w:szCs w:val="24"/>
+          <w14:shadow w14:blurRad="38100" w14:dist="19050" w14:dir="2700000" w14:sx="100000" w14:sy="100000" w14:kx="0" w14:ky="0" w14:algn="tl">
+            <w14:schemeClr w14:val="dk1">
+              <w14:alpha w14:val="60000"/>
+            </w14:schemeClr>
+          </w14:shadow>
+          <w14:textOutline w14:w="0" w14:cap="flat" w14:cmpd="sng" w14:algn="ctr">
+            <w14:noFill/>
+            <w14:prstDash w14:val="solid"/>
+            <w14:round/>
+          </w14:textOutline>
+        </w:rPr>
+        <w:t>dataType</w:t>
+      </w:r>
+      <w:proofErr w:type="spellEnd"/>
+      <w:r>
+        <w:rPr>
+          <w:bCs/>
+          <w:color w:val="000000" w:themeColor="text1"/>
+          <w:sz w:val="24"/>
+          <w:szCs w:val="24"/>
+          <w14:shadow w14:blurRad="38100" w14:dist="19050" w14:dir="2700000" w14:sx="100000" w14:sy="100000" w14:kx="0" w14:ky="0" w14:algn="tl">
+            <w14:schemeClr w14:val="dk1">
+              <w14:alpha w14:val="60000"/>
+            </w14:schemeClr>
+          </w14:shadow>
+          <w14:textOutline w14:w="0" w14:cap="flat" w14:cmpd="sng" w14:algn="ctr">
+            <w14:noFill/>
+            <w14:prstDash w14:val="solid"/>
+            <w14:round/>
+          </w14:textOutline>
+        </w:rPr>
+        <w:t>: '</w:t>
+      </w:r>
+      <w:proofErr w:type="spellStart"/>
+      <w:r>
+        <w:rPr>
+          <w:bCs/>
+          <w:color w:val="000000" w:themeColor="text1"/>
+          <w:sz w:val="24"/>
+          <w:szCs w:val="24"/>
+          <w14:shadow w14:blurRad="38100" w14:dist="19050" w14:dir="2700000" w14:sx="100000" w14:sy="100000" w14:kx="0" w14:ky="0" w14:algn="tl">
+            <w14:schemeClr w14:val="dk1">
+              <w14:alpha w14:val="60000"/>
+            </w14:schemeClr>
+          </w14:shadow>
+          <w14:textOutline w14:w="0" w14:cap="flat" w14:cmpd="sng" w14:algn="ctr">
+            <w14:noFill/>
+            <w14:prstDash w14:val="solid"/>
+            <w14:round/>
+          </w14:textOutline>
+        </w:rPr>
+        <w:t>json</w:t>
+      </w:r>
+      <w:proofErr w:type="spellEnd"/>
+      <w:r>
+        <w:rPr>
+          <w:bCs/>
+          <w:color w:val="000000" w:themeColor="text1"/>
+          <w:sz w:val="24"/>
+          <w:szCs w:val="24"/>
+          <w14:shadow w14:blurRad="38100" w14:dist="19050" w14:dir="2700000" w14:sx="100000" w14:sy="100000" w14:kx="0" w14:ky="0" w14:algn="tl">
+            <w14:schemeClr w14:val="dk1">
+              <w14:alpha w14:val="60000"/>
+            </w14:schemeClr>
+          </w14:shadow>
+          <w14:textOutline w14:w="0" w14:cap="flat" w14:cmpd="sng" w14:algn="ctr">
+            <w14:noFill/>
+            <w14:prstDash w14:val="solid"/>
+            <w14:round/>
+          </w14:textOutline>
+        </w:rPr>
+        <w:t>',</w:t>
+      </w:r>
+    </w:p>
+    <w:p>
+      <w:pPr>
+        <w:shd w:val="clear" w:color="auto" w:fill="FFFFFF"/>
+        <w:spacing w:before="150" w:after="150" w:line="240" w:lineRule="auto"/>
+        <w:outlineLvl w:val="1"/>
+        <w:rPr>
+          <w:bCs/>
+          <w:color w:val="000000" w:themeColor="text1"/>
+          <w:sz w:val="24"/>
+          <w:szCs w:val="24"/>
+          <w14:shadow w14:blurRad="38100" w14:dist="19050" w14:dir="2700000" w14:sx="100000" w14:sy="100000" w14:kx="0" w14:ky="0" w14:algn="tl">
+            <w14:schemeClr w14:val="dk1">
+              <w14:alpha w14:val="60000"/>
+            </w14:schemeClr>
+          </w14:shadow>
+          <w14:textOutline w14:w="0" w14:cap="flat" w14:cmpd="sng" w14:algn="ctr">
+            <w14:noFill/>
+            <w14:prstDash w14:val="solid"/>
+            <w14:round/>
+          </w14:textOutline>
+        </w:rPr>
+      </w:pPr>
+      <w:r>
+        <w:rPr>
+          <w:bCs/>
+          <w:color w:val="000000" w:themeColor="text1"/>
+          <w:sz w:val="24"/>
+          <w:szCs w:val="24"/>
+          <w14:shadow w14:blurRad="38100" w14:dist="19050" w14:dir="2700000" w14:sx="100000" w14:sy="100000" w14:kx="0" w14:ky="0" w14:algn="tl">
+            <w14:schemeClr w14:val="dk1">
+              <w14:alpha w14:val="60000"/>
+            </w14:schemeClr>
+          </w14:shadow>
+          <w14:textOutline w14:w="0" w14:cap="flat" w14:cmpd="sng" w14:algn="ctr">
+            <w14:noFill/>
+            <w14:prstDash w14:val="solid"/>
+            <w14:round/>
+          </w14:textOutline>
+        </w:rPr>
+        <w:t xml:space="preserve">    success: </w:t>
+      </w:r>
+      <w:r>
+        <w:rPr>
+          <w:bCs/>
+          <w:i/>
+          <w:iCs/>
+          <w:color w:val="000000" w:themeColor="text1"/>
+          <w:sz w:val="24"/>
+          <w:szCs w:val="24"/>
+          <w14:shadow w14:blurRad="38100" w14:dist="19050" w14:dir="2700000" w14:sx="100000" w14:sy="100000" w14:kx="0" w14:ky="0" w14:algn="tl">
+            <w14:schemeClr w14:val="dk1">
+              <w14:alpha w14:val="60000"/>
+            </w14:schemeClr>
+          </w14:shadow>
+          <w14:textOutline w14:w="0" w14:cap="flat" w14:cmpd="sng" w14:algn="ctr">
+            <w14:noFill/>
+            <w14:prstDash w14:val="solid"/>
+            <w14:round/>
+          </w14:textOutline>
+        </w:rPr>
+        <w:t>function</w:t>
+      </w:r>
+      <w:r>
+        <w:rPr>
+          <w:bCs/>
+          <w:color w:val="000000" w:themeColor="text1"/>
+          <w:sz w:val="24"/>
+          <w:szCs w:val="24"/>
+          <w14:shadow w14:blurRad="38100" w14:dist="19050" w14:dir="2700000" w14:sx="100000" w14:sy="100000" w14:kx="0" w14:ky="0" w14:algn="tl">
+            <w14:schemeClr w14:val="dk1">
+              <w14:alpha w14:val="60000"/>
+            </w14:schemeClr>
+          </w14:shadow>
+          <w14:textOutline w14:w="0" w14:cap="flat" w14:cmpd="sng" w14:algn="ctr">
+            <w14:noFill/>
+            <w14:prstDash w14:val="solid"/>
+            <w14:round/>
+          </w14:textOutline>
+        </w:rPr>
+        <w:t>(</w:t>
+      </w:r>
+      <w:r>
+        <w:rPr>
+          <w:bCs/>
+          <w:i/>
+          <w:iCs/>
+          <w:color w:val="000000" w:themeColor="text1"/>
+          <w:sz w:val="24"/>
+          <w:szCs w:val="24"/>
+          <w14:shadow w14:blurRad="38100" w14:dist="19050" w14:dir="2700000" w14:sx="100000" w14:sy="100000" w14:kx="0" w14:ky="0" w14:algn="tl">
+            <w14:schemeClr w14:val="dk1">
+              <w14:alpha w14:val="60000"/>
+            </w14:schemeClr>
+          </w14:shadow>
+          <w14:textOutline w14:w="0" w14:cap="flat" w14:cmpd="sng" w14:algn="ctr">
+            <w14:noFill/>
+            <w14:prstDash w14:val="solid"/>
+            <w14:round/>
+          </w14:textOutline>
+        </w:rPr>
+        <w:t>data</w:t>
+      </w:r>
+      <w:r>
+        <w:rPr>
+          <w:bCs/>
+          <w:color w:val="000000" w:themeColor="text1"/>
+          <w:sz w:val="24"/>
+          <w:szCs w:val="24"/>
+          <w14:shadow w14:blurRad="38100" w14:dist="19050" w14:dir="2700000" w14:sx="100000" w14:sy="100000" w14:kx="0" w14:ky="0" w14:algn="tl">
+            <w14:schemeClr w14:val="dk1">
+              <w14:alpha w14:val="60000"/>
+            </w14:schemeClr>
+          </w14:shadow>
+          <w14:textOutline w14:w="0" w14:cap="flat" w14:cmpd="sng" w14:algn="ctr">
+            <w14:noFill/>
+            <w14:prstDash w14:val="solid"/>
+            <w14:round/>
+          </w14:textOutline>
+        </w:rPr>
+        <w:t>) {</w:t>
+      </w:r>
+    </w:p>
+    <w:p>
+      <w:pPr>
+        <w:shd w:val="clear" w:color="auto" w:fill="FFFFFF"/>
+        <w:spacing w:before="150" w:after="150" w:line="240" w:lineRule="auto"/>
+        <w:outlineLvl w:val="1"/>
+        <w:rPr>
+          <w:bCs/>
+          <w:color w:val="000000" w:themeColor="text1"/>
+          <w:sz w:val="24"/>
+          <w:szCs w:val="24"/>
+          <w14:shadow w14:blurRad="38100" w14:dist="19050" w14:dir="2700000" w14:sx="100000" w14:sy="100000" w14:kx="0" w14:ky="0" w14:algn="tl">
+            <w14:schemeClr w14:val="dk1">
+              <w14:alpha w14:val="60000"/>
+            </w14:schemeClr>
+          </w14:shadow>
+          <w14:textOutline w14:w="0" w14:cap="flat" w14:cmpd="sng" w14:algn="ctr">
+            <w14:noFill/>
+            <w14:prstDash w14:val="solid"/>
+            <w14:round/>
+          </w14:textOutline>
+        </w:rPr>
+      </w:pPr>
+      <w:r>
+        <w:rPr>
+          <w:bCs/>
+          <w:color w:val="000000" w:themeColor="text1"/>
+          <w:sz w:val="24"/>
+          <w:szCs w:val="24"/>
+          <w14:shadow w14:blurRad="38100" w14:dist="19050" w14:dir="2700000" w14:sx="100000" w14:sy="100000" w14:kx="0" w14:ky="0" w14:algn="tl">
+            <w14:schemeClr w14:val="dk1">
+              <w14:alpha w14:val="60000"/>
+            </w14:schemeClr>
+          </w14:shadow>
+          <w14:textOutline w14:w="0" w14:cap="flat" w14:cmpd="sng" w14:algn="ctr">
+            <w14:noFill/>
+            <w14:prstDash w14:val="solid"/>
+            <w14:round/>
+          </w14:textOutline>
+        </w:rPr>
+        <w:t xml:space="preserve">      </w:t>
+      </w:r>
+      <w:proofErr w:type="spellStart"/>
+      <w:r>
+        <w:rPr>
+          <w:bCs/>
+          <w:i/>
+          <w:iCs/>
+          <w:color w:val="000000" w:themeColor="text1"/>
+          <w:sz w:val="24"/>
+          <w:szCs w:val="24"/>
+          <w14:shadow w14:blurRad="38100" w14:dist="19050" w14:dir="2700000" w14:sx="100000" w14:sy="100000" w14:kx="0" w14:ky="0" w14:algn="tl">
+            <w14:schemeClr w14:val="dk1">
+              <w14:alpha w14:val="60000"/>
+            </w14:schemeClr>
+          </w14:shadow>
+          <w14:textOutline w14:w="0" w14:cap="flat" w14:cmpd="sng" w14:algn="ctr">
+            <w14:noFill/>
+            <w14:prstDash w14:val="solid"/>
+            <w14:round/>
+          </w14:textOutline>
+        </w:rPr>
+        <w:t>const</w:t>
+      </w:r>
+      <w:proofErr w:type="spellEnd"/>
+      <w:r>
+        <w:rPr>
+          <w:bCs/>
+          <w:color w:val="000000" w:themeColor="text1"/>
+          <w:sz w:val="24"/>
+          <w:szCs w:val="24"/>
+          <w14:shadow w14:blurRad="38100" w14:dist="19050" w14:dir="2700000" w14:sx="100000" w14:sy="100000" w14:kx="0" w14:ky="0" w14:algn="tl">
+            <w14:schemeClr w14:val="dk1">
+              <w14:alpha w14:val="60000"/>
+            </w14:schemeClr>
+          </w14:shadow>
+          <w14:textOutline w14:w="0" w14:cap="flat" w14:cmpd="sng" w14:algn="ctr">
+            <w14:noFill/>
+            <w14:prstDash w14:val="solid"/>
+            <w14:round/>
+          </w14:textOutline>
+        </w:rPr>
+        <w:t xml:space="preserve"> html = </w:t>
+      </w:r>
+      <w:proofErr w:type="spellStart"/>
+      <w:proofErr w:type="gramStart"/>
+      <w:r>
+        <w:rPr>
+          <w:bCs/>
+          <w:color w:val="000000" w:themeColor="text1"/>
+          <w:sz w:val="24"/>
+          <w:szCs w:val="24"/>
+          <w14:shadow w14:blurRad="38100" w14:dist="19050" w14:dir="2700000" w14:sx="100000" w14:sy="100000" w14:kx="0" w14:ky="0" w14:algn="tl">
+            <w14:schemeClr w14:val="dk1">
+              <w14:alpha w14:val="60000"/>
+            </w14:schemeClr>
+          </w14:shadow>
+          <w14:textOutline w14:w="0" w14:cap="flat" w14:cmpd="sng" w14:algn="ctr">
+            <w14:noFill/>
+            <w14:prstDash w14:val="solid"/>
+            <w14:round/>
+          </w14:textOutline>
+        </w:rPr>
+        <w:t>data.map</w:t>
+      </w:r>
+      <w:proofErr w:type="spellEnd"/>
+      <w:r>
+        <w:rPr>
+          <w:bCs/>
+          <w:color w:val="000000" w:themeColor="text1"/>
+          <w:sz w:val="24"/>
+          <w:szCs w:val="24"/>
+          <w14:shadow w14:blurRad="38100" w14:dist="19050" w14:dir="2700000" w14:sx="100000" w14:sy="100000" w14:kx="0" w14:ky="0" w14:algn="tl">
+            <w14:schemeClr w14:val="dk1">
+              <w14:alpha w14:val="60000"/>
+            </w14:schemeClr>
+          </w14:shadow>
+          <w14:textOutline w14:w="0" w14:cap="flat" w14:cmpd="sng" w14:algn="ctr">
+            <w14:noFill/>
+            <w14:prstDash w14:val="solid"/>
+            <w14:round/>
+          </w14:textOutline>
+        </w:rPr>
+        <w:t>(</w:t>
+      </w:r>
+      <w:proofErr w:type="gramEnd"/>
+      <w:r>
+        <w:rPr>
+          <w:bCs/>
+          <w:i/>
+          <w:iCs/>
+          <w:color w:val="000000" w:themeColor="text1"/>
+          <w:sz w:val="24"/>
+          <w:szCs w:val="24"/>
+          <w14:shadow w14:blurRad="38100" w14:dist="19050" w14:dir="2700000" w14:sx="100000" w14:sy="100000" w14:kx="0" w14:ky="0" w14:algn="tl">
+            <w14:schemeClr w14:val="dk1">
+              <w14:alpha w14:val="60000"/>
+            </w14:schemeClr>
+          </w14:shadow>
+          <w14:textOutline w14:w="0" w14:cap="flat" w14:cmpd="sng" w14:algn="ctr">
+            <w14:noFill/>
+            <w14:prstDash w14:val="solid"/>
+            <w14:round/>
+          </w14:textOutline>
+        </w:rPr>
+        <w:t>product</w:t>
+      </w:r>
+      <w:r>
+        <w:rPr>
+          <w:bCs/>
+          <w:color w:val="000000" w:themeColor="text1"/>
+          <w:sz w:val="24"/>
+          <w:szCs w:val="24"/>
+          <w14:shadow w14:blurRad="38100" w14:dist="19050" w14:dir="2700000" w14:sx="100000" w14:sy="100000" w14:kx="0" w14:ky="0" w14:algn="tl">
+            <w14:schemeClr w14:val="dk1">
+              <w14:alpha w14:val="60000"/>
+            </w14:schemeClr>
+          </w14:shadow>
+          <w14:textOutline w14:w="0" w14:cap="flat" w14:cmpd="sng" w14:algn="ctr">
+            <w14:noFill/>
+            <w14:prstDash w14:val="solid"/>
+            <w14:round/>
+          </w14:textOutline>
+        </w:rPr>
+        <w:t xml:space="preserve"> =&gt; {</w:t>
+      </w:r>
+    </w:p>
+    <w:p>
+      <w:pPr>
+        <w:shd w:val="clear" w:color="auto" w:fill="FFFFFF"/>
+        <w:spacing w:before="150" w:after="150" w:line="240" w:lineRule="auto"/>
+        <w:outlineLvl w:val="1"/>
+        <w:rPr>
+          <w:bCs/>
+          <w:color w:val="000000" w:themeColor="text1"/>
+          <w:sz w:val="24"/>
+          <w:szCs w:val="24"/>
+          <w14:shadow w14:blurRad="38100" w14:dist="19050" w14:dir="2700000" w14:sx="100000" w14:sy="100000" w14:kx="0" w14:ky="0" w14:algn="tl">
+            <w14:schemeClr w14:val="dk1">
+              <w14:alpha w14:val="60000"/>
+            </w14:schemeClr>
+          </w14:shadow>
+          <w14:textOutline w14:w="0" w14:cap="flat" w14:cmpd="sng" w14:algn="ctr">
+            <w14:noFill/>
+            <w14:prstDash w14:val="solid"/>
+            <w14:round/>
+          </w14:textOutline>
+        </w:rPr>
+      </w:pPr>
+      <w:r>
+        <w:rPr>
+          <w:bCs/>
+          <w:color w:val="000000" w:themeColor="text1"/>
+          <w:sz w:val="24"/>
+          <w:szCs w:val="24"/>
+          <w14:shadow w14:blurRad="38100" w14:dist="19050" w14:dir="2700000" w14:sx="100000" w14:sy="100000" w14:kx="0" w14:ky="0" w14:algn="tl">
+            <w14:schemeClr w14:val="dk1">
+              <w14:alpha w14:val="60000"/>
+            </w14:schemeClr>
+          </w14:shadow>
+          <w14:textOutline w14:w="0" w14:cap="flat" w14:cmpd="sng" w14:algn="ctr">
+            <w14:noFill/>
+            <w14:prstDash w14:val="solid"/>
+            <w14:round/>
+          </w14:textOutline>
+        </w:rPr>
+        <w:t>        return `</w:t>
+      </w:r>
+    </w:p>
+    <w:p>
+      <w:pPr>
+        <w:shd w:val="clear" w:color="auto" w:fill="FFFFFF"/>
+        <w:spacing w:before="150" w:after="150" w:line="240" w:lineRule="auto"/>
+        <w:outlineLvl w:val="1"/>
+        <w:rPr>
+          <w:bCs/>
+          <w:color w:val="000000" w:themeColor="text1"/>
+          <w:sz w:val="24"/>
+          <w:szCs w:val="24"/>
+          <w14:shadow w14:blurRad="38100" w14:dist="19050" w14:dir="2700000" w14:sx="100000" w14:sy="100000" w14:kx="0" w14:ky="0" w14:algn="tl">
+            <w14:schemeClr w14:val="dk1">
+              <w14:alpha w14:val="60000"/>
+            </w14:schemeClr>
+          </w14:shadow>
+          <w14:textOutline w14:w="0" w14:cap="flat" w14:cmpd="sng" w14:algn="ctr">
+            <w14:noFill/>
+            <w14:prstDash w14:val="solid"/>
+            <w14:round/>
+          </w14:textOutline>
+        </w:rPr>
+      </w:pPr>
+      <w:r>
+        <w:rPr>
+          <w:bCs/>
+          <w:color w:val="000000" w:themeColor="text1"/>
+          <w:sz w:val="24"/>
+          <w:szCs w:val="24"/>
+          <w14:shadow w14:blurRad="38100" w14:dist="19050" w14:dir="2700000" w14:sx="100000" w14:sy="100000" w14:kx="0" w14:ky="0" w14:algn="tl">
+            <w14:schemeClr w14:val="dk1">
+              <w14:alpha w14:val="60000"/>
+            </w14:schemeClr>
+          </w14:shadow>
+          <w14:textOutline w14:w="0" w14:cap="flat" w14:cmpd="sng" w14:algn="ctr">
+            <w14:noFill/>
+            <w14:prstDash w14:val="solid"/>
+            <w14:round/>
+          </w14:textOutline>
+        </w:rPr>
+        <w:t>          &lt;div class="col-sm-4"&gt;</w:t>
+      </w:r>
+    </w:p>
+    <w:p>
+      <w:pPr>
+        <w:shd w:val="clear" w:color="auto" w:fill="FFFFFF"/>
+        <w:spacing w:before="150" w:after="150" w:line="240" w:lineRule="auto"/>
+        <w:outlineLvl w:val="1"/>
+        <w:rPr>
+          <w:bCs/>
+          <w:color w:val="000000" w:themeColor="text1"/>
+          <w:sz w:val="24"/>
+          <w:szCs w:val="24"/>
+          <w14:shadow w14:blurRad="38100" w14:dist="19050" w14:dir="2700000" w14:sx="100000" w14:sy="100000" w14:kx="0" w14:ky="0" w14:algn="tl">
+            <w14:schemeClr w14:val="dk1">
+              <w14:alpha w14:val="60000"/>
+            </w14:schemeClr>
+          </w14:shadow>
+          <w14:textOutline w14:w="0" w14:cap="flat" w14:cmpd="sng" w14:algn="ctr">
+            <w14:noFill/>
+            <w14:prstDash w14:val="solid"/>
+            <w14:round/>
+          </w14:textOutline>
+        </w:rPr>
+      </w:pPr>
+      <w:r>
+        <w:rPr>
+          <w:bCs/>
+          <w:color w:val="000000" w:themeColor="text1"/>
+          <w:sz w:val="24"/>
+          <w:szCs w:val="24"/>
+          <w14:shadow w14:blurRad="38100" w14:dist="19050" w14:dir="2700000" w14:sx="100000" w14:sy="100000" w14:kx="0" w14:ky="0" w14:algn="tl">
+            <w14:schemeClr w14:val="dk1">
+              <w14:alpha w14:val="60000"/>
+            </w14:schemeClr>
+          </w14:shadow>
+          <w14:textOutline w14:w="0" w14:cap="flat" w14:cmpd="sng" w14:algn="ctr">
+            <w14:noFill/>
+            <w14:prstDash w14:val="solid"/>
+            <w14:round/>
+          </w14:textOutline>
+        </w:rPr>
+        <w:t>              &lt;</w:t>
+      </w:r>
+      <w:proofErr w:type="spellStart"/>
+      <w:r>
+        <w:rPr>
+          <w:bCs/>
+          <w:color w:val="000000" w:themeColor="text1"/>
+          <w:sz w:val="24"/>
+          <w:szCs w:val="24"/>
+          <w14:shadow w14:blurRad="38100" w14:dist="19050" w14:dir="2700000" w14:sx="100000" w14:sy="100000" w14:kx="0" w14:ky="0" w14:algn="tl">
+            <w14:schemeClr w14:val="dk1">
+              <w14:alpha w14:val="60000"/>
+            </w14:schemeClr>
+          </w14:shadow>
+          <w14:textOutline w14:w="0" w14:cap="flat" w14:cmpd="sng" w14:algn="ctr">
+            <w14:noFill/>
+            <w14:prstDash w14:val="solid"/>
+            <w14:round/>
+          </w14:textOutline>
+        </w:rPr>
+        <w:t>img</w:t>
+      </w:r>
+      <w:proofErr w:type="spellEnd"/>
+      <w:r>
+        <w:rPr>
+          <w:bCs/>
+          <w:color w:val="000000" w:themeColor="text1"/>
+          <w:sz w:val="24"/>
+          <w:szCs w:val="24"/>
+          <w14:shadow w14:blurRad="38100" w14:dist="19050" w14:dir="2700000" w14:sx="100000" w14:sy="100000" w14:kx="0" w14:ky="0" w14:algn="tl">
+            <w14:schemeClr w14:val="dk1">
+              <w14:alpha w14:val="60000"/>
+            </w14:schemeClr>
+          </w14:shadow>
+          <w14:textOutline w14:w="0" w14:cap="flat" w14:cmpd="sng" w14:algn="ctr">
+            <w14:noFill/>
+            <w14:prstDash w14:val="solid"/>
+            <w14:round/>
+          </w14:textOutline>
+        </w:rPr>
+        <w:t xml:space="preserve"> </w:t>
+      </w:r>
+      <w:proofErr w:type="spellStart"/>
+      <w:r>
+        <w:rPr>
+          <w:bCs/>
+          <w:color w:val="000000" w:themeColor="text1"/>
+          <w:sz w:val="24"/>
+          <w:szCs w:val="24"/>
+          <w14:shadow w14:blurRad="38100" w14:dist="19050" w14:dir="2700000" w14:sx="100000" w14:sy="100000" w14:kx="0" w14:ky="0" w14:algn="tl">
+            <w14:schemeClr w14:val="dk1">
+              <w14:alpha w14:val="60000"/>
+            </w14:schemeClr>
+          </w14:shadow>
+          <w14:textOutline w14:w="0" w14:cap="flat" w14:cmpd="sng" w14:algn="ctr">
+            <w14:noFill/>
+            <w14:prstDash w14:val="solid"/>
+            <w14:round/>
+          </w14:textOutline>
+        </w:rPr>
+        <w:t>src</w:t>
+      </w:r>
+      <w:proofErr w:type="spellEnd"/>
+      <w:r>
+        <w:rPr>
+          <w:bCs/>
+          <w:color w:val="000000" w:themeColor="text1"/>
+          <w:sz w:val="24"/>
+          <w:szCs w:val="24"/>
+          <w14:shadow w14:blurRad="38100" w14:dist="19050" w14:dir="2700000" w14:sx="100000" w14:sy="100000" w14:kx="0" w14:ky="0" w14:algn="tl">
+            <w14:schemeClr w14:val="dk1">
+              <w14:alpha w14:val="60000"/>
+            </w14:schemeClr>
+          </w14:shadow>
+          <w14:textOutline w14:w="0" w14:cap="flat" w14:cmpd="sng" w14:algn="ctr">
+            <w14:noFill/>
+            <w14:prstDash w14:val="solid"/>
+            <w14:round/>
+          </w14:textOutline>
+        </w:rPr>
+        <w:t>="${</w:t>
+      </w:r>
+      <w:proofErr w:type="spellStart"/>
+      <w:proofErr w:type="gramStart"/>
+      <w:r>
+        <w:rPr>
+          <w:bCs/>
+          <w:color w:val="000000" w:themeColor="text1"/>
+          <w:sz w:val="24"/>
+          <w:szCs w:val="24"/>
+          <w14:shadow w14:blurRad="38100" w14:dist="19050" w14:dir="2700000" w14:sx="100000" w14:sy="100000" w14:kx="0" w14:ky="0" w14:algn="tl">
+            <w14:schemeClr w14:val="dk1">
+              <w14:alpha w14:val="60000"/>
+            </w14:schemeClr>
+          </w14:shadow>
+          <w14:textOutline w14:w="0" w14:cap="flat" w14:cmpd="sng" w14:algn="ctr">
+            <w14:noFill/>
+            <w14:prstDash w14:val="solid"/>
+            <w14:round/>
+          </w14:textOutline>
+        </w:rPr>
+        <w:t>product.image</w:t>
+      </w:r>
+      <w:proofErr w:type="spellEnd"/>
+      <w:proofErr w:type="gramEnd"/>
+      <w:r>
+        <w:rPr>
+          <w:bCs/>
+          <w:color w:val="000000" w:themeColor="text1"/>
+          <w:sz w:val="24"/>
+          <w:szCs w:val="24"/>
+          <w14:shadow w14:blurRad="38100" w14:dist="19050" w14:dir="2700000" w14:sx="100000" w14:sy="100000" w14:kx="0" w14:ky="0" w14:algn="tl">
+            <w14:schemeClr w14:val="dk1">
+              <w14:alpha w14:val="60000"/>
+            </w14:schemeClr>
+          </w14:shadow>
+          <w14:textOutline w14:w="0" w14:cap="flat" w14:cmpd="sng" w14:algn="ctr">
+            <w14:noFill/>
+            <w14:prstDash w14:val="solid"/>
+            <w14:round/>
+          </w14:textOutline>
+        </w:rPr>
+        <w:t>}" style="width:100px" "alt="${</w:t>
+      </w:r>
+      <w:proofErr w:type="spellStart"/>
+      <w:r>
+        <w:rPr>
+          <w:bCs/>
+          <w:color w:val="000000" w:themeColor="text1"/>
+          <w:sz w:val="24"/>
+          <w:szCs w:val="24"/>
+          <w14:shadow w14:blurRad="38100" w14:dist="19050" w14:dir="2700000" w14:sx="100000" w14:sy="100000" w14:kx="0" w14:ky="0" w14:algn="tl">
+            <w14:schemeClr w14:val="dk1">
+              <w14:alpha w14:val="60000"/>
+            </w14:schemeClr>
+          </w14:shadow>
+          <w14:textOutline w14:w="0" w14:cap="flat" w14:cmpd="sng" w14:algn="ctr">
+            <w14:noFill/>
+            <w14:prstDash w14:val="solid"/>
+            <w14:round/>
+          </w14:textOutline>
+        </w:rPr>
+        <w:t>product.title</w:t>
+      </w:r>
+      <w:proofErr w:type="spellEnd"/>
+      <w:r>
+        <w:rPr>
+          <w:bCs/>
+          <w:color w:val="000000" w:themeColor="text1"/>
+          <w:sz w:val="24"/>
+          <w:szCs w:val="24"/>
+          <w14:shadow w14:blurRad="38100" w14:dist="19050" w14:dir="2700000" w14:sx="100000" w14:sy="100000" w14:kx="0" w14:ky="0" w14:algn="tl">
+            <w14:schemeClr w14:val="dk1">
+              <w14:alpha w14:val="60000"/>
+            </w14:schemeClr>
+          </w14:shadow>
+          <w14:textOutline w14:w="0" w14:cap="flat" w14:cmpd="sng" w14:algn="ctr">
+            <w14:noFill/>
+            <w14:prstDash w14:val="solid"/>
+            <w14:round/>
+          </w14:textOutline>
+        </w:rPr>
+        <w:t>}"&gt;</w:t>
+      </w:r>
+    </w:p>
+    <w:p>
+      <w:pPr>
+        <w:shd w:val="clear" w:color="auto" w:fill="FFFFFF"/>
+        <w:spacing w:before="150" w:after="150" w:line="240" w:lineRule="auto"/>
+        <w:outlineLvl w:val="1"/>
+        <w:rPr>
+          <w:bCs/>
+          <w:color w:val="000000" w:themeColor="text1"/>
+          <w:sz w:val="24"/>
+          <w:szCs w:val="24"/>
+          <w14:shadow w14:blurRad="38100" w14:dist="19050" w14:dir="2700000" w14:sx="100000" w14:sy="100000" w14:kx="0" w14:ky="0" w14:algn="tl">
+            <w14:schemeClr w14:val="dk1">
+              <w14:alpha w14:val="60000"/>
+            </w14:schemeClr>
+          </w14:shadow>
+          <w14:textOutline w14:w="0" w14:cap="flat" w14:cmpd="sng" w14:algn="ctr">
+            <w14:noFill/>
+            <w14:prstDash w14:val="solid"/>
+            <w14:round/>
+          </w14:textOutline>
+        </w:rPr>
+      </w:pPr>
+      <w:r>
+        <w:rPr>
+          <w:bCs/>
+          <w:color w:val="000000" w:themeColor="text1"/>
+          <w:sz w:val="24"/>
+          <w:szCs w:val="24"/>
+          <w14:shadow w14:blurRad="38100" w14:dist="19050" w14:dir="2700000" w14:sx="100000" w14:sy="100000" w14:kx="0" w14:ky="0" w14:algn="tl">
+            <w14:schemeClr w14:val="dk1">
+              <w14:alpha w14:val="60000"/>
+            </w14:schemeClr>
+          </w14:shadow>
+          <w14:textOutline w14:w="0" w14:cap="flat" w14:cmpd="sng" w14:algn="ctr">
+            <w14:noFill/>
+            <w14:prstDash w14:val="solid"/>
+            <w14:round/>
+          </w14:textOutline>
+        </w:rPr>
+        <w:t>            &lt;h6&gt;&lt;p class="${product.url}"&gt;${</w:t>
+      </w:r>
+      <w:proofErr w:type="spellStart"/>
+      <w:proofErr w:type="gramStart"/>
+      <w:r>
+        <w:rPr>
+          <w:bCs/>
+          <w:color w:val="000000" w:themeColor="text1"/>
+          <w:sz w:val="24"/>
+          <w:szCs w:val="24"/>
+          <w14:shadow w14:blurRad="38100" w14:dist="19050" w14:dir="2700000" w14:sx="100000" w14:sy="100000" w14:kx="0" w14:ky="0" w14:algn="tl">
+            <w14:schemeClr w14:val="dk1">
+              <w14:alpha w14:val="60000"/>
+            </w14:schemeClr>
+          </w14:shadow>
+          <w14:textOutline w14:w="0" w14:cap="flat" w14:cmpd="sng" w14:algn="ctr">
+            <w14:noFill/>
+            <w14:prstDash w14:val="solid"/>
+            <w14:round/>
+          </w14:textOutline>
+        </w:rPr>
+        <w:t>product.title</w:t>
+      </w:r>
+      <w:proofErr w:type="spellEnd"/>
+      <w:proofErr w:type="gramEnd"/>
+      <w:r>
+        <w:rPr>
+          <w:bCs/>
+          <w:color w:val="000000" w:themeColor="text1"/>
+          <w:sz w:val="24"/>
+          <w:szCs w:val="24"/>
+          <w14:shadow w14:blurRad="38100" w14:dist="19050" w14:dir="2700000" w14:sx="100000" w14:sy="100000" w14:kx="0" w14:ky="0" w14:algn="tl">
+            <w14:schemeClr w14:val="dk1">
+              <w14:alpha w14:val="60000"/>
+            </w14:schemeClr>
+          </w14:shadow>
+          <w14:textOutline w14:w="0" w14:cap="flat" w14:cmpd="sng" w14:algn="ctr">
+            <w14:noFill/>
+            <w14:prstDash w14:val="solid"/>
+            <w14:round/>
+          </w14:textOutline>
+        </w:rPr>
+        <w:t>}&lt;/p&gt;&lt;/h6&gt;</w:t>
+      </w:r>
+    </w:p>
+    <w:p>
+      <w:pPr>
+        <w:shd w:val="clear" w:color="auto" w:fill="FFFFFF"/>
+        <w:spacing w:before="150" w:after="150" w:line="240" w:lineRule="auto"/>
+        <w:outlineLvl w:val="1"/>
+        <w:rPr>
+          <w:bCs/>
+          <w:color w:val="000000" w:themeColor="text1"/>
+          <w:sz w:val="24"/>
+          <w:szCs w:val="24"/>
+          <w14:shadow w14:blurRad="38100" w14:dist="19050" w14:dir="2700000" w14:sx="100000" w14:sy="100000" w14:kx="0" w14:ky="0" w14:algn="tl">
+            <w14:schemeClr w14:val="dk1">
+              <w14:alpha w14:val="60000"/>
+            </w14:schemeClr>
+          </w14:shadow>
+          <w14:textOutline w14:w="0" w14:cap="flat" w14:cmpd="sng" w14:algn="ctr">
+            <w14:noFill/>
+            <w14:prstDash w14:val="solid"/>
+            <w14:round/>
+          </w14:textOutline>
+        </w:rPr>
+      </w:pPr>
+      <w:r>
+        <w:rPr>
+          <w:bCs/>
+          <w:color w:val="000000" w:themeColor="text1"/>
+          <w:sz w:val="24"/>
+          <w:szCs w:val="24"/>
+          <w14:shadow w14:blurRad="38100" w14:dist="19050" w14:dir="2700000" w14:sx="100000" w14:sy="100000" w14:kx="0" w14:ky="0" w14:algn="tl">
+            <w14:schemeClr w14:val="dk1">
+              <w14:alpha w14:val="60000"/>
+            </w14:schemeClr>
+          </w14:shadow>
+          <w14:textOutline w14:w="0" w14:cap="flat" w14:cmpd="sng" w14:algn="ctr">
+            <w14:noFill/>
+            <w14:prstDash w14:val="solid"/>
+            <w14:round/>
+          </w14:textOutline>
+        </w:rPr>
+        <w:t>            &lt;p class="text-muted"&gt;Price: $${</w:t>
+      </w:r>
+      <w:proofErr w:type="spellStart"/>
+      <w:proofErr w:type="gramStart"/>
+      <w:r>
+        <w:rPr>
+          <w:bCs/>
+          <w:color w:val="000000" w:themeColor="text1"/>
+          <w:sz w:val="24"/>
+          <w:szCs w:val="24"/>
+          <w14:shadow w14:blurRad="38100" w14:dist="19050" w14:dir="2700000" w14:sx="100000" w14:sy="100000" w14:kx="0" w14:ky="0" w14:algn="tl">
+            <w14:schemeClr w14:val="dk1">
+              <w14:alpha w14:val="60000"/>
+            </w14:schemeClr>
+          </w14:shadow>
+          <w14:textOutline w14:w="0" w14:cap="flat" w14:cmpd="sng" w14:algn="ctr">
+            <w14:noFill/>
+            <w14:prstDash w14:val="solid"/>
+            <w14:round/>
+          </w14:textOutline>
+        </w:rPr>
+        <w:t>product.price</w:t>
+      </w:r>
+      <w:proofErr w:type="spellEnd"/>
+      <w:proofErr w:type="gramEnd"/>
+      <w:r>
+        <w:rPr>
+          <w:bCs/>
+          <w:color w:val="000000" w:themeColor="text1"/>
+          <w:sz w:val="24"/>
+          <w:szCs w:val="24"/>
+          <w14:shadow w14:blurRad="38100" w14:dist="19050" w14:dir="2700000" w14:sx="100000" w14:sy="100000" w14:kx="0" w14:ky="0" w14:algn="tl">
+            <w14:schemeClr w14:val="dk1">
+              <w14:alpha w14:val="60000"/>
+            </w14:schemeClr>
+          </w14:shadow>
+          <w14:textOutline w14:w="0" w14:cap="flat" w14:cmpd="sng" w14:algn="ctr">
+            <w14:noFill/>
+            <w14:prstDash w14:val="solid"/>
+            <w14:round/>
+          </w14:textOutline>
+        </w:rPr>
+        <w:t>}&lt;/p&gt;</w:t>
+      </w:r>
+    </w:p>
+    <w:p>
+      <w:pPr>
+        <w:shd w:val="clear" w:color="auto" w:fill="FFFFFF"/>
+        <w:spacing w:before="150" w:after="150" w:line="240" w:lineRule="auto"/>
+        <w:outlineLvl w:val="1"/>
+        <w:rPr>
+          <w:bCs/>
+          <w:color w:val="000000" w:themeColor="text1"/>
+          <w:sz w:val="24"/>
+          <w:szCs w:val="24"/>
+          <w14:shadow w14:blurRad="38100" w14:dist="19050" w14:dir="2700000" w14:sx="100000" w14:sy="100000" w14:kx="0" w14:ky="0" w14:algn="tl">
+            <w14:schemeClr w14:val="dk1">
+              <w14:alpha w14:val="60000"/>
+            </w14:schemeClr>
+          </w14:shadow>
+          <w14:textOutline w14:w="0" w14:cap="flat" w14:cmpd="sng" w14:algn="ctr">
+            <w14:noFill/>
+            <w14:prstDash w14:val="solid"/>
+            <w14:round/>
+          </w14:textOutline>
+        </w:rPr>
+      </w:pPr>
+      <w:r>
+        <w:rPr>
+          <w:bCs/>
+          <w:color w:val="000000" w:themeColor="text1"/>
+          <w:sz w:val="24"/>
+          <w:szCs w:val="24"/>
+          <w14:shadow w14:blurRad="38100" w14:dist="19050" w14:dir="2700000" w14:sx="100000" w14:sy="100000" w14:kx="0" w14:ky="0" w14:algn="tl">
+            <w14:schemeClr w14:val="dk1">
+              <w14:alpha w14:val="60000"/>
+            </w14:schemeClr>
+          </w14:shadow>
+          <w14:textOutline w14:w="0" w14:cap="flat" w14:cmpd="sng" w14:algn="ctr">
+            <w14:noFill/>
+            <w14:prstDash w14:val="solid"/>
+            <w14:round/>
+          </w14:textOutline>
+        </w:rPr>
+        <w:t>            &lt;p class="text-muted"&gt;Description: ${</w:t>
+      </w:r>
+      <w:proofErr w:type="spellStart"/>
+      <w:proofErr w:type="gramStart"/>
+      <w:r>
+        <w:rPr>
+          <w:bCs/>
+          <w:color w:val="000000" w:themeColor="text1"/>
+          <w:sz w:val="24"/>
+          <w:szCs w:val="24"/>
+          <w14:shadow w14:blurRad="38100" w14:dist="19050" w14:dir="2700000" w14:sx="100000" w14:sy="100000" w14:kx="0" w14:ky="0" w14:algn="tl">
+            <w14:schemeClr w14:val="dk1">
+              <w14:alpha w14:val="60000"/>
+            </w14:schemeClr>
+          </w14:shadow>
+          <w14:textOutline w14:w="0" w14:cap="flat" w14:cmpd="sng" w14:algn="ctr">
+            <w14:noFill/>
+            <w14:prstDash w14:val="solid"/>
+            <w14:round/>
+          </w14:textOutline>
+        </w:rPr>
+        <w:t>product.description</w:t>
+      </w:r>
+      <w:proofErr w:type="spellEnd"/>
+      <w:proofErr w:type="gramEnd"/>
+      <w:r>
+        <w:rPr>
+          <w:bCs/>
+          <w:color w:val="000000" w:themeColor="text1"/>
+          <w:sz w:val="24"/>
+          <w:szCs w:val="24"/>
+          <w14:shadow w14:blurRad="38100" w14:dist="19050" w14:dir="2700000" w14:sx="100000" w14:sy="100000" w14:kx="0" w14:ky="0" w14:algn="tl">
+            <w14:schemeClr w14:val="dk1">
+              <w14:alpha w14:val="60000"/>
+            </w14:schemeClr>
+          </w14:shadow>
+          <w14:textOutline w14:w="0" w14:cap="flat" w14:cmpd="sng" w14:algn="ctr">
+            <w14:noFill/>
+            <w14:prstDash w14:val="solid"/>
+            <w14:round/>
+          </w14:textOutline>
+        </w:rPr>
+        <w:t>}&lt;/p&gt;</w:t>
+      </w:r>
+    </w:p>
+    <w:p>
+      <w:pPr>
+        <w:shd w:val="clear" w:color="auto" w:fill="FFFFFF"/>
+        <w:spacing w:before="150" w:after="150" w:line="240" w:lineRule="auto"/>
+        <w:outlineLvl w:val="1"/>
+        <w:rPr>
+          <w:bCs/>
+          <w:color w:val="000000" w:themeColor="text1"/>
+          <w:sz w:val="24"/>
+          <w:szCs w:val="24"/>
+          <w14:shadow w14:blurRad="38100" w14:dist="19050" w14:dir="2700000" w14:sx="100000" w14:sy="100000" w14:kx="0" w14:ky="0" w14:algn="tl">
+            <w14:schemeClr w14:val="dk1">
+              <w14:alpha w14:val="60000"/>
+            </w14:schemeClr>
+          </w14:shadow>
+          <w14:textOutline w14:w="0" w14:cap="flat" w14:cmpd="sng" w14:algn="ctr">
+            <w14:noFill/>
+            <w14:prstDash w14:val="solid"/>
+            <w14:round/>
+          </w14:textOutline>
+        </w:rPr>
+      </w:pPr>
+      <w:r>
+        <w:rPr>
+          <w:bCs/>
+          <w:color w:val="000000" w:themeColor="text1"/>
+          <w:sz w:val="24"/>
+          <w:szCs w:val="24"/>
+          <w14:shadow w14:blurRad="38100" w14:dist="19050" w14:dir="2700000" w14:sx="100000" w14:sy="100000" w14:kx="0" w14:ky="0" w14:algn="tl">
+            <w14:schemeClr w14:val="dk1">
+              <w14:alpha w14:val="60000"/>
+            </w14:schemeClr>
+          </w14:shadow>
+          <w14:textOutline w14:w="0" w14:cap="flat" w14:cmpd="sng" w14:algn="ctr">
+            <w14:noFill/>
+            <w14:prstDash w14:val="solid"/>
+            <w14:round/>
+          </w14:textOutline>
+        </w:rPr>
+        <w:t>            &lt;p class="text-muted"&gt;Category: ${</w:t>
+      </w:r>
+      <w:proofErr w:type="spellStart"/>
+      <w:proofErr w:type="gramStart"/>
+      <w:r>
+        <w:rPr>
+          <w:bCs/>
+          <w:color w:val="000000" w:themeColor="text1"/>
+          <w:sz w:val="24"/>
+          <w:szCs w:val="24"/>
+          <w14:shadow w14:blurRad="38100" w14:dist="19050" w14:dir="2700000" w14:sx="100000" w14:sy="100000" w14:kx="0" w14:ky="0" w14:algn="tl">
+            <w14:schemeClr w14:val="dk1">
+              <w14:alpha w14:val="60000"/>
+            </w14:schemeClr>
+          </w14:shadow>
+          <w14:textOutline w14:w="0" w14:cap="flat" w14:cmpd="sng" w14:algn="ctr">
+            <w14:noFill/>
+            <w14:prstDash w14:val="solid"/>
+            <w14:round/>
+          </w14:textOutline>
+        </w:rPr>
+        <w:t>product.category</w:t>
+      </w:r>
+      <w:proofErr w:type="spellEnd"/>
+      <w:proofErr w:type="gramEnd"/>
+      <w:r>
+        <w:rPr>
+          <w:bCs/>
+          <w:color w:val="000000" w:themeColor="text1"/>
+          <w:sz w:val="24"/>
+          <w:szCs w:val="24"/>
+          <w14:shadow w14:blurRad="38100" w14:dist="19050" w14:dir="2700000" w14:sx="100000" w14:sy="100000" w14:kx="0" w14:ky="0" w14:algn="tl">
+            <w14:schemeClr w14:val="dk1">
+              <w14:alpha w14:val="60000"/>
+            </w14:schemeClr>
+          </w14:shadow>
+          <w14:textOutline w14:w="0" w14:cap="flat" w14:cmpd="sng" w14:algn="ctr">
+            <w14:noFill/>
+            <w14:prstDash w14:val="solid"/>
+            <w14:round/>
+          </w14:textOutline>
+        </w:rPr>
+        <w:t xml:space="preserve">}&lt;/p&gt; </w:t>
+      </w:r>
+    </w:p>
+    <w:p>
+      <w:pPr>
+        <w:shd w:val="clear" w:color="auto" w:fill="FFFFFF"/>
+        <w:spacing w:before="150" w:after="150" w:line="240" w:lineRule="auto"/>
+        <w:outlineLvl w:val="1"/>
+        <w:rPr>
+          <w:bCs/>
+          <w:color w:val="000000" w:themeColor="text1"/>
+          <w:sz w:val="24"/>
+          <w:szCs w:val="24"/>
+          <w14:shadow w14:blurRad="38100" w14:dist="19050" w14:dir="2700000" w14:sx="100000" w14:sy="100000" w14:kx="0" w14:ky="0" w14:algn="tl">
+            <w14:schemeClr w14:val="dk1">
+              <w14:alpha w14:val="60000"/>
+            </w14:schemeClr>
+          </w14:shadow>
+          <w14:textOutline w14:w="0" w14:cap="flat" w14:cmpd="sng" w14:algn="ctr">
+            <w14:noFill/>
+            <w14:prstDash w14:val="solid"/>
+            <w14:round/>
+          </w14:textOutline>
+        </w:rPr>
+      </w:pPr>
+      <w:r>
+        <w:rPr>
+          <w:bCs/>
+          <w:color w:val="000000" w:themeColor="text1"/>
+          <w:sz w:val="24"/>
+          <w:szCs w:val="24"/>
+          <w14:shadow w14:blurRad="38100" w14:dist="19050" w14:dir="2700000" w14:sx="100000" w14:sy="100000" w14:kx="0" w14:ky="0" w14:algn="tl">
+            <w14:schemeClr w14:val="dk1">
+              <w14:alpha w14:val="60000"/>
+            </w14:schemeClr>
+          </w14:shadow>
+          <w14:textOutline w14:w="0" w14:cap="flat" w14:cmpd="sng" w14:algn="ctr">
+            <w14:noFill/>
+            <w14:prstDash w14:val="solid"/>
+            <w14:round/>
+          </w14:textOutline>
+        </w:rPr>
+        <w:t>            &lt;p class="text-muted"&gt;Rating: ${</w:t>
+      </w:r>
+      <w:proofErr w:type="spellStart"/>
+      <w:proofErr w:type="gramStart"/>
+      <w:r>
+        <w:rPr>
+          <w:bCs/>
+          <w:color w:val="000000" w:themeColor="text1"/>
+          <w:sz w:val="24"/>
+          <w:szCs w:val="24"/>
+          <w14:shadow w14:blurRad="38100" w14:dist="19050" w14:dir="2700000" w14:sx="100000" w14:sy="100000" w14:kx="0" w14:ky="0" w14:algn="tl">
+            <w14:schemeClr w14:val="dk1">
+              <w14:alpha w14:val="60000"/>
+            </w14:schemeClr>
+          </w14:shadow>
+          <w14:textOutline w14:w="0" w14:cap="flat" w14:cmpd="sng" w14:algn="ctr">
+            <w14:noFill/>
+            <w14:prstDash w14:val="solid"/>
+            <w14:round/>
+          </w14:textOutline>
+        </w:rPr>
+        <w:t>product.rating</w:t>
+      </w:r>
+      <w:proofErr w:type="gramEnd"/>
+      <w:r>
+        <w:rPr>
+          <w:bCs/>
+          <w:color w:val="000000" w:themeColor="text1"/>
+          <w:sz w:val="24"/>
+          <w:szCs w:val="24"/>
+          <w14:shadow w14:blurRad="38100" w14:dist="19050" w14:dir="2700000" w14:sx="100000" w14:sy="100000" w14:kx="0" w14:ky="0" w14:algn="tl">
+            <w14:schemeClr w14:val="dk1">
+              <w14:alpha w14:val="60000"/>
+            </w14:schemeClr>
+          </w14:shadow>
+          <w14:textOutline w14:w="0" w14:cap="flat" w14:cmpd="sng" w14:algn="ctr">
+            <w14:noFill/>
+            <w14:prstDash w14:val="solid"/>
+            <w14:round/>
+          </w14:textOutline>
+        </w:rPr>
+        <w:t>.rate</w:t>
+      </w:r>
+      <w:proofErr w:type="spellEnd"/>
+      <w:r>
+        <w:rPr>
+          <w:bCs/>
+          <w:color w:val="000000" w:themeColor="text1"/>
+          <w:sz w:val="24"/>
+          <w:szCs w:val="24"/>
+          <w14:shadow w14:blurRad="38100" w14:dist="19050" w14:dir="2700000" w14:sx="100000" w14:sy="100000" w14:kx="0" w14:ky="0" w14:algn="tl">
+            <w14:schemeClr w14:val="dk1">
+              <w14:alpha w14:val="60000"/>
+            </w14:schemeClr>
+          </w14:shadow>
+          <w14:textOutline w14:w="0" w14:cap="flat" w14:cmpd="sng" w14:algn="ctr">
+            <w14:noFill/>
+            <w14:prstDash w14:val="solid"/>
+            <w14:round/>
+          </w14:textOutline>
+        </w:rPr>
+        <w:t>} (${</w:t>
+      </w:r>
+      <w:proofErr w:type="spellStart"/>
+      <w:r>
+        <w:rPr>
+          <w:bCs/>
+          <w:color w:val="000000" w:themeColor="text1"/>
+          <w:sz w:val="24"/>
+          <w:szCs w:val="24"/>
+          <w14:shadow w14:blurRad="38100" w14:dist="19050" w14:dir="2700000" w14:sx="100000" w14:sy="100000" w14:kx="0" w14:ky="0" w14:algn="tl">
+            <w14:schemeClr w14:val="dk1">
+              <w14:alpha w14:val="60000"/>
+            </w14:schemeClr>
+          </w14:shadow>
+          <w14:textOutline w14:w="0" w14:cap="flat" w14:cmpd="sng" w14:algn="ctr">
+            <w14:noFill/>
+            <w14:prstDash w14:val="solid"/>
+            <w14:round/>
+          </w14:textOutline>
+        </w:rPr>
+        <w:t>product.rating.count</w:t>
+      </w:r>
+      <w:proofErr w:type="spellEnd"/>
+      <w:r>
+        <w:rPr>
+          <w:bCs/>
+          <w:color w:val="000000" w:themeColor="text1"/>
+          <w:sz w:val="24"/>
+          <w:szCs w:val="24"/>
+          <w14:shadow w14:blurRad="38100" w14:dist="19050" w14:dir="2700000" w14:sx="100000" w14:sy="100000" w14:kx="0" w14:ky="0" w14:algn="tl">
+            <w14:schemeClr w14:val="dk1">
+              <w14:alpha w14:val="60000"/>
+            </w14:schemeClr>
+          </w14:shadow>
+          <w14:textOutline w14:w="0" w14:cap="flat" w14:cmpd="sng" w14:algn="ctr">
+            <w14:noFill/>
+            <w14:prstDash w14:val="solid"/>
+            <w14:round/>
+          </w14:textOutline>
+        </w:rPr>
+        <w:t>} reviews)&lt;/p&gt;</w:t>
+      </w:r>
+    </w:p>
+    <w:p>
+      <w:pPr>
+        <w:shd w:val="clear" w:color="auto" w:fill="FFFFFF"/>
+        <w:spacing w:before="150" w:after="150" w:line="240" w:lineRule="auto"/>
+        <w:outlineLvl w:val="1"/>
+        <w:rPr>
+          <w:bCs/>
+          <w:color w:val="000000" w:themeColor="text1"/>
+          <w:sz w:val="24"/>
+          <w:szCs w:val="24"/>
+          <w14:shadow w14:blurRad="38100" w14:dist="19050" w14:dir="2700000" w14:sx="100000" w14:sy="100000" w14:kx="0" w14:ky="0" w14:algn="tl">
+            <w14:schemeClr w14:val="dk1">
+              <w14:alpha w14:val="60000"/>
+            </w14:schemeClr>
+          </w14:shadow>
+          <w14:textOutline w14:w="0" w14:cap="flat" w14:cmpd="sng" w14:algn="ctr">
+            <w14:noFill/>
+            <w14:prstDash w14:val="solid"/>
+            <w14:round/>
+          </w14:textOutline>
+        </w:rPr>
+      </w:pPr>
+      <w:r>
+        <w:rPr>
+          <w:bCs/>
+          <w:color w:val="000000" w:themeColor="text1"/>
+          <w:sz w:val="24"/>
+          <w:szCs w:val="24"/>
+          <w14:shadow w14:blurRad="38100" w14:dist="19050" w14:dir="2700000" w14:sx="100000" w14:sy="100000" w14:kx="0" w14:ky="0" w14:algn="tl">
+            <w14:schemeClr w14:val="dk1">
+              <w14:alpha w14:val="60000"/>
+            </w14:schemeClr>
+          </w14:shadow>
+          <w14:textOutline w14:w="0" w14:cap="flat" w14:cmpd="sng" w14:algn="ctr">
+            <w14:noFill/>
+            <w14:prstDash w14:val="solid"/>
+            <w14:round/>
+          </w14:textOutline>
+        </w:rPr>
+        <w:t xml:space="preserve">          </w:t>
+      </w:r>
+    </w:p>
+    <w:p>
+      <w:pPr>
+        <w:shd w:val="clear" w:color="auto" w:fill="FFFFFF"/>
+        <w:spacing w:before="150" w:after="150" w:line="240" w:lineRule="auto"/>
+        <w:outlineLvl w:val="1"/>
+        <w:rPr>
+          <w:bCs/>
+          <w:color w:val="000000" w:themeColor="text1"/>
+          <w:sz w:val="24"/>
+          <w:szCs w:val="24"/>
+          <w14:shadow w14:blurRad="38100" w14:dist="19050" w14:dir="2700000" w14:sx="100000" w14:sy="100000" w14:kx="0" w14:ky="0" w14:algn="tl">
+            <w14:schemeClr w14:val="dk1">
+              <w14:alpha w14:val="60000"/>
+            </w14:schemeClr>
+          </w14:shadow>
+          <w14:textOutline w14:w="0" w14:cap="flat" w14:cmpd="sng" w14:algn="ctr">
+            <w14:noFill/>
+            <w14:prstDash w14:val="solid"/>
+            <w14:round/>
+          </w14:textOutline>
+        </w:rPr>
+      </w:pPr>
+      <w:r>
+        <w:rPr>
+          <w:bCs/>
+          <w:color w:val="000000" w:themeColor="text1"/>
+          <w:sz w:val="24"/>
+          <w:szCs w:val="24"/>
+          <w14:shadow w14:blurRad="38100" w14:dist="19050" w14:dir="2700000" w14:sx="100000" w14:sy="100000" w14:kx="0" w14:ky="0" w14:algn="tl">
+            <w14:schemeClr w14:val="dk1">
+              <w14:alpha w14:val="60000"/>
+            </w14:schemeClr>
+          </w14:shadow>
+          <w14:textOutline w14:w="0" w14:cap="flat" w14:cmpd="sng" w14:algn="ctr">
+            <w14:noFill/>
+            <w14:prstDash w14:val="solid"/>
+            <w14:round/>
+          </w14:textOutline>
+        </w:rPr>
+        <w:t>          &lt;/div&gt;</w:t>
+      </w:r>
+    </w:p>
+    <w:p>
+      <w:pPr>
+        <w:shd w:val="clear" w:color="auto" w:fill="FFFFFF"/>
+        <w:spacing w:before="150" w:after="150" w:line="240" w:lineRule="auto"/>
+        <w:outlineLvl w:val="1"/>
+        <w:rPr>
+          <w:bCs/>
+          <w:color w:val="000000" w:themeColor="text1"/>
+          <w:sz w:val="24"/>
+          <w:szCs w:val="24"/>
+          <w14:shadow w14:blurRad="38100" w14:dist="19050" w14:dir="2700000" w14:sx="100000" w14:sy="100000" w14:kx="0" w14:ky="0" w14:algn="tl">
+            <w14:schemeClr w14:val="dk1">
+              <w14:alpha w14:val="60000"/>
+            </w14:schemeClr>
+          </w14:shadow>
+          <w14:textOutline w14:w="0" w14:cap="flat" w14:cmpd="sng" w14:algn="ctr">
+            <w14:noFill/>
+            <w14:prstDash w14:val="solid"/>
+            <w14:round/>
+          </w14:textOutline>
+        </w:rPr>
+      </w:pPr>
+      <w:r>
+        <w:rPr>
+          <w:bCs/>
+          <w:color w:val="000000" w:themeColor="text1"/>
+          <w:sz w:val="24"/>
+          <w:szCs w:val="24"/>
+          <w14:shadow w14:blurRad="38100" w14:dist="19050" w14:dir="2700000" w14:sx="100000" w14:sy="100000" w14:kx="0" w14:ky="0" w14:algn="tl">
+            <w14:schemeClr w14:val="dk1">
+              <w14:alpha w14:val="60000"/>
+            </w14:schemeClr>
+          </w14:shadow>
+          <w14:textOutline w14:w="0" w14:cap="flat" w14:cmpd="sng" w14:algn="ctr">
+            <w14:noFill/>
+            <w14:prstDash w14:val="solid"/>
+            <w14:round/>
+          </w14:textOutline>
+        </w:rPr>
+        <w:t>        `;</w:t>
+      </w:r>
+    </w:p>
+    <w:p>
+      <w:pPr>
+        <w:shd w:val="clear" w:color="auto" w:fill="FFFFFF"/>
+        <w:spacing w:before="150" w:after="150" w:line="240" w:lineRule="auto"/>
+        <w:outlineLvl w:val="1"/>
+        <w:rPr>
+          <w:bCs/>
+          <w:color w:val="000000" w:themeColor="text1"/>
+          <w:sz w:val="24"/>
+          <w:szCs w:val="24"/>
+          <w14:shadow w14:blurRad="38100" w14:dist="19050" w14:dir="2700000" w14:sx="100000" w14:sy="100000" w14:kx="0" w14:ky="0" w14:algn="tl">
+            <w14:schemeClr w14:val="dk1">
+              <w14:alpha w14:val="60000"/>
+            </w14:schemeClr>
+          </w14:shadow>
+          <w14:textOutline w14:w="0" w14:cap="flat" w14:cmpd="sng" w14:algn="ctr">
+            <w14:noFill/>
+            <w14:prstDash w14:val="solid"/>
+            <w14:round/>
+          </w14:textOutline>
+        </w:rPr>
+      </w:pPr>
+      <w:r>
+        <w:rPr>
+          <w:bCs/>
+          <w:color w:val="000000" w:themeColor="text1"/>
+          <w:sz w:val="24"/>
+          <w:szCs w:val="24"/>
+          <w14:shadow w14:blurRad="38100" w14:dist="19050" w14:dir="2700000" w14:sx="100000" w14:sy="100000" w14:kx="0" w14:ky="0" w14:algn="tl">
+            <w14:schemeClr w14:val="dk1">
+              <w14:alpha w14:val="60000"/>
+            </w14:schemeClr>
+          </w14:shadow>
+          <w14:textOutline w14:w="0" w14:cap="flat" w14:cmpd="sng" w14:algn="ctr">
+            <w14:noFill/>
+            <w14:prstDash w14:val="solid"/>
+            <w14:round/>
+          </w14:textOutline>
+        </w:rPr>
+        <w:t>      }</w:t>
+      </w:r>
+      <w:proofErr w:type="gramStart"/>
+      <w:r>
+        <w:rPr>
+          <w:bCs/>
+          <w:color w:val="000000" w:themeColor="text1"/>
+          <w:sz w:val="24"/>
+          <w:szCs w:val="24"/>
+          <w14:shadow w14:blurRad="38100" w14:dist="19050" w14:dir="2700000" w14:sx="100000" w14:sy="100000" w14:kx="0" w14:ky="0" w14:algn="tl">
+            <w14:schemeClr w14:val="dk1">
+              <w14:alpha w14:val="60000"/>
+            </w14:schemeClr>
+          </w14:shadow>
+          <w14:textOutline w14:w="0" w14:cap="flat" w14:cmpd="sng" w14:algn="ctr">
+            <w14:noFill/>
+            <w14:prstDash w14:val="solid"/>
+            <w14:round/>
+          </w14:textOutline>
+        </w:rPr>
+        <w:t>).join</w:t>
+      </w:r>
+      <w:proofErr w:type="gramEnd"/>
+      <w:r>
+        <w:rPr>
+          <w:bCs/>
+          <w:color w:val="000000" w:themeColor="text1"/>
+          <w:sz w:val="24"/>
+          <w:szCs w:val="24"/>
+          <w14:shadow w14:blurRad="38100" w14:dist="19050" w14:dir="2700000" w14:sx="100000" w14:sy="100000" w14:kx="0" w14:ky="0" w14:algn="tl">
+            <w14:schemeClr w14:val="dk1">
+              <w14:alpha w14:val="60000"/>
+            </w14:schemeClr>
+          </w14:shadow>
+          <w14:textOutline w14:w="0" w14:cap="flat" w14:cmpd="sng" w14:algn="ctr">
+            <w14:noFill/>
+            <w14:prstDash w14:val="solid"/>
+            <w14:round/>
+          </w14:textOutline>
+        </w:rPr>
+        <w:t>('');</w:t>
+      </w:r>
+    </w:p>
+    <w:p>
+      <w:pPr>
+        <w:shd w:val="clear" w:color="auto" w:fill="FFFFFF"/>
+        <w:spacing w:before="150" w:after="150" w:line="240" w:lineRule="auto"/>
+        <w:outlineLvl w:val="1"/>
+        <w:rPr>
+          <w:bCs/>
+          <w:color w:val="000000" w:themeColor="text1"/>
+          <w:sz w:val="24"/>
+          <w:szCs w:val="24"/>
+          <w14:shadow w14:blurRad="38100" w14:dist="19050" w14:dir="2700000" w14:sx="100000" w14:sy="100000" w14:kx="0" w14:ky="0" w14:algn="tl">
+            <w14:schemeClr w14:val="dk1">
+              <w14:alpha w14:val="60000"/>
+            </w14:schemeClr>
+          </w14:shadow>
+          <w14:textOutline w14:w="0" w14:cap="flat" w14:cmpd="sng" w14:algn="ctr">
+            <w14:noFill/>
+            <w14:prstDash w14:val="solid"/>
+            <w14:round/>
+          </w14:textOutline>
+        </w:rPr>
+      </w:pPr>
+      <w:r>
+        <w:rPr>
+          <w:bCs/>
+          <w:color w:val="000000" w:themeColor="text1"/>
+          <w:sz w:val="24"/>
+          <w:szCs w:val="24"/>
+          <w14:shadow w14:blurRad="38100" w14:dist="19050" w14:dir="2700000" w14:sx="100000" w14:sy="100000" w14:kx="0" w14:ky="0" w14:algn="tl">
+            <w14:schemeClr w14:val="dk1">
+              <w14:alpha w14:val="60000"/>
+            </w14:schemeClr>
+          </w14:shadow>
+          <w14:textOutline w14:w="0" w14:cap="flat" w14:cmpd="sng" w14:algn="ctr">
+            <w14:noFill/>
+            <w14:prstDash w14:val="solid"/>
+            <w14:round/>
+          </w14:textOutline>
+        </w:rPr>
+        <w:t>      $(</w:t>
+      </w:r>
+      <w:proofErr w:type="gramStart"/>
+      <w:r>
+        <w:rPr>
+          <w:bCs/>
+          <w:color w:val="000000" w:themeColor="text1"/>
+          <w:sz w:val="24"/>
+          <w:szCs w:val="24"/>
+          <w14:shadow w14:blurRad="38100" w14:dist="19050" w14:dir="2700000" w14:sx="100000" w14:sy="100000" w14:kx="0" w14:ky="0" w14:algn="tl">
+            <w14:schemeClr w14:val="dk1">
+              <w14:alpha w14:val="60000"/>
+            </w14:schemeClr>
+          </w14:shadow>
+          <w14:textOutline w14:w="0" w14:cap="flat" w14:cmpd="sng" w14:algn="ctr">
+            <w14:noFill/>
+            <w14:prstDash w14:val="solid"/>
+            <w14:round/>
+          </w14:textOutline>
+        </w:rPr>
+        <w:t>".</w:t>
+      </w:r>
+      <w:proofErr w:type="spellStart"/>
+      <w:r>
+        <w:rPr>
+          <w:bCs/>
+          <w:color w:val="000000" w:themeColor="text1"/>
+          <w:sz w:val="24"/>
+          <w:szCs w:val="24"/>
+          <w14:shadow w14:blurRad="38100" w14:dist="19050" w14:dir="2700000" w14:sx="100000" w14:sy="100000" w14:kx="0" w14:ky="0" w14:algn="tl">
+            <w14:schemeClr w14:val="dk1">
+              <w14:alpha w14:val="60000"/>
+            </w14:schemeClr>
+          </w14:shadow>
+          <w14:textOutline w14:w="0" w14:cap="flat" w14:cmpd="sng" w14:algn="ctr">
+            <w14:noFill/>
+            <w14:prstDash w14:val="solid"/>
+            <w14:round/>
+          </w14:textOutline>
+        </w:rPr>
+        <w:t>mypanel</w:t>
+      </w:r>
+      <w:proofErr w:type="spellEnd"/>
+      <w:proofErr w:type="gramEnd"/>
+      <w:r>
+        <w:rPr>
+          <w:bCs/>
+          <w:color w:val="000000" w:themeColor="text1"/>
+          <w:sz w:val="24"/>
+          <w:szCs w:val="24"/>
+          <w14:shadow w14:blurRad="38100" w14:dist="19050" w14:dir="2700000" w14:sx="100000" w14:sy="100000" w14:kx="0" w14:ky="0" w14:algn="tl">
+            <w14:schemeClr w14:val="dk1">
+              <w14:alpha w14:val="60000"/>
+            </w14:schemeClr>
+          </w14:shadow>
+          <w14:textOutline w14:w="0" w14:cap="flat" w14:cmpd="sng" w14:algn="ctr">
+            <w14:noFill/>
+            <w14:prstDash w14:val="solid"/>
+            <w14:round/>
+          </w14:textOutline>
+        </w:rPr>
+        <w:t>").html(`</w:t>
+      </w:r>
+    </w:p>
+    <w:p>
+      <w:pPr>
+        <w:shd w:val="clear" w:color="auto" w:fill="FFFFFF"/>
+        <w:spacing w:before="150" w:after="150" w:line="240" w:lineRule="auto"/>
+        <w:outlineLvl w:val="1"/>
+        <w:rPr>
+          <w:bCs/>
+          <w:color w:val="000000" w:themeColor="text1"/>
+          <w:sz w:val="24"/>
+          <w:szCs w:val="24"/>
+          <w14:shadow w14:blurRad="38100" w14:dist="19050" w14:dir="2700000" w14:sx="100000" w14:sy="100000" w14:kx="0" w14:ky="0" w14:algn="tl">
+            <w14:schemeClr w14:val="dk1">
+              <w14:alpha w14:val="60000"/>
+            </w14:schemeClr>
+          </w14:shadow>
+          <w14:textOutline w14:w="0" w14:cap="flat" w14:cmpd="sng" w14:algn="ctr">
+            <w14:noFill/>
+            <w14:prstDash w14:val="solid"/>
+            <w14:round/>
+          </w14:textOutline>
+        </w:rPr>
+      </w:pPr>
+      <w:r>
+        <w:rPr>
+          <w:bCs/>
+          <w:color w:val="000000" w:themeColor="text1"/>
+          <w:sz w:val="24"/>
+          <w:szCs w:val="24"/>
+          <w14:shadow w14:blurRad="38100" w14:dist="19050" w14:dir="2700000" w14:sx="100000" w14:sy="100000" w14:kx="0" w14:ky="0" w14:algn="tl">
+            <w14:schemeClr w14:val="dk1">
+              <w14:alpha w14:val="60000"/>
+            </w14:schemeClr>
+          </w14:shadow>
+          <w14:textOutline w14:w="0" w14:cap="flat" w14:cmpd="sng" w14:algn="ctr">
+            <w14:noFill/>
+            <w14:prstDash w14:val="solid"/>
+            <w14:round/>
+          </w14:textOutline>
+        </w:rPr>
+        <w:t>        &lt;div class="container mt-5"&gt;</w:t>
+      </w:r>
+    </w:p>
+    <w:p>
+      <w:pPr>
+        <w:shd w:val="clear" w:color="auto" w:fill="FFFFFF"/>
+        <w:spacing w:before="150" w:after="150" w:line="240" w:lineRule="auto"/>
+        <w:outlineLvl w:val="1"/>
+        <w:rPr>
+          <w:bCs/>
+          <w:color w:val="000000" w:themeColor="text1"/>
+          <w:sz w:val="24"/>
+          <w:szCs w:val="24"/>
+          <w14:shadow w14:blurRad="38100" w14:dist="19050" w14:dir="2700000" w14:sx="100000" w14:sy="100000" w14:kx="0" w14:ky="0" w14:algn="tl">
+            <w14:schemeClr w14:val="dk1">
+              <w14:alpha w14:val="60000"/>
+            </w14:schemeClr>
+          </w14:shadow>
+          <w14:textOutline w14:w="0" w14:cap="flat" w14:cmpd="sng" w14:algn="ctr">
+            <w14:noFill/>
+            <w14:prstDash w14:val="solid"/>
+            <w14:round/>
+          </w14:textOutline>
+        </w:rPr>
+      </w:pPr>
+      <w:r>
+        <w:rPr>
+          <w:bCs/>
+          <w:color w:val="000000" w:themeColor="text1"/>
+          <w:sz w:val="24"/>
+          <w:szCs w:val="24"/>
+          <w14:shadow w14:blurRad="38100" w14:dist="19050" w14:dir="2700000" w14:sx="100000" w14:sy="100000" w14:kx="0" w14:ky="0" w14:algn="tl">
+            <w14:schemeClr w14:val="dk1">
+              <w14:alpha w14:val="60000"/>
+            </w14:schemeClr>
+          </w14:shadow>
+          <w14:textOutline w14:w="0" w14:cap="flat" w14:cmpd="sng" w14:algn="ctr">
+            <w14:noFill/>
+            <w14:prstDash w14:val="solid"/>
+            <w14:round/>
+          </w14:textOutline>
+        </w:rPr>
+        <w:t>          &lt;div class="row"&gt;</w:t>
+      </w:r>
+    </w:p>
+    <w:p>
+      <w:pPr>
+        <w:shd w:val="clear" w:color="auto" w:fill="FFFFFF"/>
+        <w:spacing w:before="150" w:after="150" w:line="240" w:lineRule="auto"/>
+        <w:outlineLvl w:val="1"/>
+        <w:rPr>
+          <w:bCs/>
+          <w:color w:val="000000" w:themeColor="text1"/>
+          <w:sz w:val="24"/>
+          <w:szCs w:val="24"/>
+          <w14:shadow w14:blurRad="38100" w14:dist="19050" w14:dir="2700000" w14:sx="100000" w14:sy="100000" w14:kx="0" w14:ky="0" w14:algn="tl">
+            <w14:schemeClr w14:val="dk1">
+              <w14:alpha w14:val="60000"/>
+            </w14:schemeClr>
+          </w14:shadow>
+          <w14:textOutline w14:w="0" w14:cap="flat" w14:cmpd="sng" w14:algn="ctr">
+            <w14:noFill/>
+            <w14:prstDash w14:val="solid"/>
+            <w14:round/>
+          </w14:textOutline>
+        </w:rPr>
+      </w:pPr>
+      <w:r>
+        <w:rPr>
+          <w:bCs/>
+          <w:color w:val="000000" w:themeColor="text1"/>
+          <w:sz w:val="24"/>
+          <w:szCs w:val="24"/>
+          <w14:shadow w14:blurRad="38100" w14:dist="19050" w14:dir="2700000" w14:sx="100000" w14:sy="100000" w14:kx="0" w14:ky="0" w14:algn="tl">
+            <w14:schemeClr w14:val="dk1">
+              <w14:alpha w14:val="60000"/>
+            </w14:schemeClr>
+          </w14:shadow>
+          <w14:textOutline w14:w="0" w14:cap="flat" w14:cmpd="sng" w14:algn="ctr">
+            <w14:noFill/>
+            <w14:prstDash w14:val="solid"/>
+            <w14:round/>
+          </w14:textOutline>
+        </w:rPr>
+        <w:t>            ${html}</w:t>
+      </w:r>
+    </w:p>
+    <w:p>
+      <w:pPr>
+        <w:shd w:val="clear" w:color="auto" w:fill="FFFFFF"/>
+        <w:spacing w:before="150" w:after="150" w:line="240" w:lineRule="auto"/>
+        <w:outlineLvl w:val="1"/>
+        <w:rPr>
+          <w:bCs/>
+          <w:color w:val="000000" w:themeColor="text1"/>
+          <w:sz w:val="24"/>
+          <w:szCs w:val="24"/>
+          <w14:shadow w14:blurRad="38100" w14:dist="19050" w14:dir="2700000" w14:sx="100000" w14:sy="100000" w14:kx="0" w14:ky="0" w14:algn="tl">
+            <w14:schemeClr w14:val="dk1">
+              <w14:alpha w14:val="60000"/>
+            </w14:schemeClr>
+          </w14:shadow>
+          <w14:textOutline w14:w="0" w14:cap="flat" w14:cmpd="sng" w14:algn="ctr">
+            <w14:noFill/>
+            <w14:prstDash w14:val="solid"/>
+            <w14:round/>
+          </w14:textOutline>
+        </w:rPr>
+      </w:pPr>
+      <w:r>
+        <w:rPr>
+          <w:bCs/>
+          <w:color w:val="000000" w:themeColor="text1"/>
+          <w:sz w:val="24"/>
+          <w:szCs w:val="24"/>
+          <w14:shadow w14:blurRad="38100" w14:dist="19050" w14:dir="2700000" w14:sx="100000" w14:sy="100000" w14:kx="0" w14:ky="0" w14:algn="tl">
+            <w14:schemeClr w14:val="dk1">
+              <w14:alpha w14:val="60000"/>
+            </w14:schemeClr>
+          </w14:shadow>
+          <w14:textOutline w14:w="0" w14:cap="flat" w14:cmpd="sng" w14:algn="ctr">
+            <w14:noFill/>
+            <w14:prstDash w14:val="solid"/>
+            <w14:round/>
+          </w14:textOutline>
+        </w:rPr>
+        <w:t>          &lt;/div&gt;</w:t>
+      </w:r>
+    </w:p>
+    <w:p>
+      <w:pPr>
+        <w:shd w:val="clear" w:color="auto" w:fill="FFFFFF"/>
+        <w:spacing w:before="150" w:after="150" w:line="240" w:lineRule="auto"/>
+        <w:outlineLvl w:val="1"/>
+        <w:rPr>
+          <w:bCs/>
+          <w:color w:val="000000" w:themeColor="text1"/>
+          <w:sz w:val="24"/>
+          <w:szCs w:val="24"/>
+          <w14:shadow w14:blurRad="38100" w14:dist="19050" w14:dir="2700000" w14:sx="100000" w14:sy="100000" w14:kx="0" w14:ky="0" w14:algn="tl">
+            <w14:schemeClr w14:val="dk1">
+              <w14:alpha w14:val="60000"/>
+            </w14:schemeClr>
+          </w14:shadow>
+          <w14:textOutline w14:w="0" w14:cap="flat" w14:cmpd="sng" w14:algn="ctr">
+            <w14:noFill/>
+            <w14:prstDash w14:val="solid"/>
+            <w14:round/>
+          </w14:textOutline>
+        </w:rPr>
+      </w:pPr>
+      <w:r>
+        <w:rPr>
+          <w:bCs/>
+          <w:color w:val="000000" w:themeColor="text1"/>
+          <w:sz w:val="24"/>
+          <w:szCs w:val="24"/>
+          <w14:shadow w14:blurRad="38100" w14:dist="19050" w14:dir="2700000" w14:sx="100000" w14:sy="100000" w14:kx="0" w14:ky="0" w14:algn="tl">
+            <w14:schemeClr w14:val="dk1">
+              <w14:alpha w14:val="60000"/>
+            </w14:schemeClr>
+          </w14:shadow>
+          <w14:textOutline w14:w="0" w14:cap="flat" w14:cmpd="sng" w14:algn="ctr">
+            <w14:noFill/>
+            <w14:prstDash w14:val="solid"/>
+            <w14:round/>
+          </w14:textOutline>
+        </w:rPr>
+        <w:t>        &lt;/div&gt;</w:t>
+      </w:r>
+    </w:p>
+    <w:p>
+      <w:pPr>
+        <w:shd w:val="clear" w:color="auto" w:fill="FFFFFF"/>
+        <w:spacing w:before="150" w:after="150" w:line="240" w:lineRule="auto"/>
+        <w:outlineLvl w:val="1"/>
+        <w:rPr>
+          <w:bCs/>
+          <w:color w:val="000000" w:themeColor="text1"/>
+          <w:sz w:val="24"/>
+          <w:szCs w:val="24"/>
+          <w14:shadow w14:blurRad="38100" w14:dist="19050" w14:dir="2700000" w14:sx="100000" w14:sy="100000" w14:kx="0" w14:ky="0" w14:algn="tl">
+            <w14:schemeClr w14:val="dk1">
+              <w14:alpha w14:val="60000"/>
+            </w14:schemeClr>
+          </w14:shadow>
+          <w14:textOutline w14:w="0" w14:cap="flat" w14:cmpd="sng" w14:algn="ctr">
+            <w14:noFill/>
+            <w14:prstDash w14:val="solid"/>
+            <w14:round/>
+          </w14:textOutline>
+        </w:rPr>
+      </w:pPr>
+      <w:r>
+        <w:rPr>
+          <w:bCs/>
+          <w:color w:val="000000" w:themeColor="text1"/>
+          <w:sz w:val="24"/>
+          <w:szCs w:val="24"/>
+          <w14:shadow w14:blurRad="38100" w14:dist="19050" w14:dir="2700000" w14:sx="100000" w14:sy="100000" w14:kx="0" w14:ky="0" w14:algn="tl">
+            <w14:schemeClr w14:val="dk1">
+              <w14:alpha w14:val="60000"/>
+            </w14:schemeClr>
+          </w14:shadow>
+          <w14:textOutline w14:w="0" w14:cap="flat" w14:cmpd="sng" w14:algn="ctr">
+            <w14:noFill/>
+            <w14:prstDash w14:val="solid"/>
+            <w14:round/>
+          </w14:textOutline>
+        </w:rPr>
+        <w:t>      `);</w:t>
+      </w:r>
+    </w:p>
+    <w:p>
+      <w:pPr>
+        <w:shd w:val="clear" w:color="auto" w:fill="FFFFFF"/>
+        <w:spacing w:before="150" w:after="150" w:line="240" w:lineRule="auto"/>
+        <w:outlineLvl w:val="1"/>
+        <w:rPr>
+          <w:bCs/>
+          <w:color w:val="000000" w:themeColor="text1"/>
+          <w:sz w:val="24"/>
+          <w:szCs w:val="24"/>
+          <w14:shadow w14:blurRad="38100" w14:dist="19050" w14:dir="2700000" w14:sx="100000" w14:sy="100000" w14:kx="0" w14:ky="0" w14:algn="tl">
+            <w14:schemeClr w14:val="dk1">
+              <w14:alpha w14:val="60000"/>
+            </w14:schemeClr>
+          </w14:shadow>
+          <w14:textOutline w14:w="0" w14:cap="flat" w14:cmpd="sng" w14:algn="ctr">
+            <w14:noFill/>
+            <w14:prstDash w14:val="solid"/>
+            <w14:round/>
+          </w14:textOutline>
+        </w:rPr>
+      </w:pPr>
+      <w:r>
+        <w:rPr>
+          <w:bCs/>
+          <w:color w:val="000000" w:themeColor="text1"/>
+          <w:sz w:val="24"/>
+          <w:szCs w:val="24"/>
+          <w14:shadow w14:blurRad="38100" w14:dist="19050" w14:dir="2700000" w14:sx="100000" w14:sy="100000" w14:kx="0" w14:ky="0" w14:algn="tl">
+            <w14:schemeClr w14:val="dk1">
+              <w14:alpha w14:val="60000"/>
+            </w14:schemeClr>
+          </w14:shadow>
+          <w14:textOutline w14:w="0" w14:cap="flat" w14:cmpd="sng" w14:algn="ctr">
+            <w14:noFill/>
+            <w14:prstDash w14:val="solid"/>
+            <w14:round/>
+          </w14:textOutline>
+        </w:rPr>
+        <w:lastRenderedPageBreak/>
+        <w:t>    }</w:t>
+      </w:r>
+    </w:p>
+    <w:p>
+      <w:pPr>
+        <w:shd w:val="clear" w:color="auto" w:fill="FFFFFF"/>
+        <w:spacing w:before="150" w:after="150" w:line="240" w:lineRule="auto"/>
+        <w:outlineLvl w:val="1"/>
+        <w:rPr>
+          <w:bCs/>
+          <w:color w:val="000000" w:themeColor="text1"/>
+          <w:sz w:val="24"/>
+          <w:szCs w:val="24"/>
+          <w14:shadow w14:blurRad="38100" w14:dist="19050" w14:dir="2700000" w14:sx="100000" w14:sy="100000" w14:kx="0" w14:ky="0" w14:algn="tl">
+            <w14:schemeClr w14:val="dk1">
+              <w14:alpha w14:val="60000"/>
+            </w14:schemeClr>
+          </w14:shadow>
+          <w14:textOutline w14:w="0" w14:cap="flat" w14:cmpd="sng" w14:algn="ctr">
+            <w14:noFill/>
+            <w14:prstDash w14:val="solid"/>
+            <w14:round/>
+          </w14:textOutline>
+        </w:rPr>
+      </w:pPr>
+      <w:r>
+        <w:rPr>
+          <w:bCs/>
+          <w:color w:val="000000" w:themeColor="text1"/>
+          <w:sz w:val="24"/>
+          <w:szCs w:val="24"/>
+          <w14:shadow w14:blurRad="38100" w14:dist="19050" w14:dir="2700000" w14:sx="100000" w14:sy="100000" w14:kx="0" w14:ky="0" w14:algn="tl">
+            <w14:schemeClr w14:val="dk1">
+              <w14:alpha w14:val="60000"/>
+            </w14:schemeClr>
+          </w14:shadow>
+          <w14:textOutline w14:w="0" w14:cap="flat" w14:cmpd="sng" w14:algn="ctr">
+            <w14:noFill/>
+            <w14:prstDash w14:val="solid"/>
+            <w14:round/>
+          </w14:textOutline>
+        </w:rPr>
+        <w:t>  });</w:t>
+      </w:r>
+    </w:p>
+    <w:p>
+      <w:pPr>
+        <w:shd w:val="clear" w:color="auto" w:fill="FFFFFF"/>
+        <w:spacing w:before="150" w:after="150" w:line="240" w:lineRule="auto"/>
+        <w:outlineLvl w:val="1"/>
+        <w:rPr>
           <w:bCs/>
           <w:color w:val="000000" w:themeColor="text1"/>
           <w:sz w:val="24"/>
@@ -28015,7 +32128,6 @@
   <w:style w:type="character" w:default="1" w:styleId="DefaultParagraphFont">
     <w:name w:val="Default Paragraph Font"/>
     <w:uiPriority w:val="1"/>
-    <w:semiHidden/>
     <w:unhideWhenUsed/>
   </w:style>
   <w:style w:type="table" w:default="1" w:styleId="TableNormal">

</xml_diff>